<commit_message>
Refactor related news badge: use concise sticker (e.g. 'Рубрика', '#tag'), remove redundant badge. Update business plan docx.
</commit_message>
<xml_diff>
--- a/zNews_Business_Plan.docx
+++ b/zNews_Business_Plan.docx
@@ -27,7 +27,6 @@
         <w:spacing w:after="50"/>
         <w:jc w:val="center"/>
       </w:pPr>
-      <w:proofErr w:type="spellStart"/>
       <w:r>
         <w:rPr>
           <w:b/>
@@ -47,7 +46,6 @@
         </w:rPr>
         <w:t>NEWS</w:t>
       </w:r>
-      <w:proofErr w:type="spellEnd"/>
     </w:p>
     <w:p>
       <w:pPr>
@@ -123,38 +121,8 @@
           <w:sz w:val="26"/>
           <w:szCs w:val="26"/>
         </w:rPr>
-        <w:t xml:space="preserve">обяви и обществени услуги в </w:t>
-      </w:r>
-      <w:proofErr w:type="spellStart"/>
-      <w:r>
-        <w:rPr>
-          <w:sz w:val="26"/>
-          <w:szCs w:val="26"/>
-        </w:rPr>
-        <w:t>Los</w:t>
-      </w:r>
-      <w:proofErr w:type="spellEnd"/>
-      <w:r>
-        <w:rPr>
-          <w:sz w:val="26"/>
-          <w:szCs w:val="26"/>
-        </w:rPr>
-        <w:t xml:space="preserve"> </w:t>
-      </w:r>
-      <w:proofErr w:type="spellStart"/>
-      <w:r>
-        <w:rPr>
-          <w:sz w:val="26"/>
-          <w:szCs w:val="26"/>
-        </w:rPr>
-        <w:t>Santos</w:t>
-      </w:r>
-      <w:proofErr w:type="spellEnd"/>
-    </w:p>
-    <w:p>
-      <w:pPr>
-        <w:spacing w:after="120"/>
-      </w:pPr>
+        <w:t>обяви и обществени услуги в Los Santos</w:t>
+      </w:r>
     </w:p>
     <w:p>
       <w:pPr>
@@ -189,31 +157,91 @@
         <w:jc w:val="center"/>
       </w:pPr>
       <w:r>
-        <w:t>Дата: 23.01.2026</w:t>
+        <w:t xml:space="preserve">Дата: </w:t>
+      </w:r>
+      <w:r>
+        <w:rPr>
+          <w:lang w:val="en-US"/>
+        </w:rPr>
+        <w:t>13</w:t>
+      </w:r>
+      <w:r>
+        <w:t>.0</w:t>
+      </w:r>
+      <w:r>
+        <w:rPr>
+          <w:lang w:val="en-US"/>
+        </w:rPr>
+        <w:t>2</w:t>
+      </w:r>
+      <w:r>
+        <w:t>.2026</w:t>
       </w:r>
     </w:p>
     <w:p>
       <w:pPr>
         <w:spacing w:after="60"/>
         <w:jc w:val="center"/>
+      </w:pPr>
+      <w:r>
+        <w:t xml:space="preserve">Подготвил: </w:t>
+      </w:r>
+      <w:r>
         <w:rPr>
           <w:lang w:val="en-US"/>
         </w:rPr>
-      </w:pPr>
-      <w:r>
-        <w:t xml:space="preserve">Подготвил: </w:t>
-      </w:r>
+        <w:t>Diego Llamas</w:t>
+      </w:r>
+    </w:p>
+    <w:p>
+      <w:pPr>
+        <w:spacing w:after="60"/>
+        <w:jc w:val="center"/>
+      </w:pPr>
+      <w:r>
+        <w:t>Капитал: $4,000</w:t>
+      </w:r>
+    </w:p>
+    <w:p>
+      <w:pPr>
+        <w:spacing w:after="60"/>
+        <w:jc w:val="center"/>
+      </w:pPr>
+      <w:r>
+        <w:t>Собственик: Diego Llamas</w:t>
+      </w:r>
+    </w:p>
+    <w:p>
+      <w:pPr>
+        <w:spacing w:after="60"/>
+        <w:jc w:val="center"/>
+      </w:pPr>
       <w:r>
         <w:rPr>
           <w:lang w:val="en-US"/>
         </w:rPr>
-        <w:t>Diego Llamas</w:t>
-      </w:r>
+        <w:t>State ID: 9821</w:t>
+      </w:r>
+    </w:p>
+    <w:p>
+      <w:pPr>
+        <w:spacing w:after="60"/>
+        <w:jc w:val="center"/>
+      </w:pPr>
+      <w:r>
+        <w:t>Телефон: 6952438</w:t>
+      </w:r>
+    </w:p>
+    <w:p>
+      <w:pPr>
+        <w:spacing w:after="60"/>
+        <w:jc w:val="center"/>
+      </w:pPr>
       <w:r>
         <w:rPr>
           <w:lang w:val="en-US"/>
         </w:rPr>
-        <w:t xml:space="preserve"> </w:t>
+        <w:t>Адрес: Lom Bank Offices 10</w:t>
       </w:r>
     </w:p>
     <w:p>
@@ -487,29 +515,8 @@
       <w:pPr>
         <w:spacing w:after="120" w:line="320" w:lineRule="auto"/>
       </w:pPr>
-      <w:proofErr w:type="spellStart"/>
-      <w:r>
-        <w:t>zNews</w:t>
-      </w:r>
-      <w:proofErr w:type="spellEnd"/>
-      <w:r>
-        <w:t xml:space="preserve"> е независим онлайн новинарски портал за града </w:t>
-      </w:r>
-      <w:proofErr w:type="spellStart"/>
-      <w:r>
-        <w:t>Los</w:t>
-      </w:r>
-      <w:proofErr w:type="spellEnd"/>
-      <w:r>
-        <w:t xml:space="preserve"> </w:t>
-      </w:r>
-      <w:proofErr w:type="spellStart"/>
-      <w:r>
-        <w:t>Santos</w:t>
-      </w:r>
-      <w:proofErr w:type="spellEnd"/>
-      <w:r>
-        <w:t>, който предоставя 24/7 покритие на градските събития, криминални хроники, бизнес новини, политика, спорт и развлечения. Платформата комбинира професионална журналистика с обществени услуги: обяви за работа, съдебни хроники, календар на събития и фотогалерия.</w:t>
+      <w:r>
+        <w:t>zNews е независим онлайн новинарски портал за града Los Santos, който предоставя 24/7 покритие на градските събития, криминални хроники, бизнес новини, политика, спорт и развлечения. Платформата комбинира професионална журналистика с обществени услуги: обяви за работа, съдебни хроники, календар на събития и фотогалерия.</w:t>
       </w:r>
     </w:p>
     <w:p>
@@ -676,12 +683,6 @@
         <w:gridCol w:w="6226"/>
       </w:tblGrid>
       <w:tr>
-        <w:tblPrEx>
-          <w:tblCellMar>
-            <w:top w:w="0" w:type="dxa"/>
-            <w:bottom w:w="0" w:type="dxa"/>
-          </w:tblCellMar>
-        </w:tblPrEx>
         <w:tc>
           <w:tcPr>
             <w:tcW w:w="0" w:type="auto"/>
@@ -738,12 +739,6 @@
         </w:tc>
       </w:tr>
       <w:tr>
-        <w:tblPrEx>
-          <w:tblCellMar>
-            <w:top w:w="0" w:type="dxa"/>
-            <w:bottom w:w="0" w:type="dxa"/>
-          </w:tblCellMar>
-        </w:tblPrEx>
         <w:tc>
           <w:tcPr>
             <w:tcW w:w="0" w:type="auto"/>
@@ -786,12 +781,6 @@
         </w:tc>
       </w:tr>
       <w:tr>
-        <w:tblPrEx>
-          <w:tblCellMar>
-            <w:top w:w="0" w:type="dxa"/>
-            <w:bottom w:w="0" w:type="dxa"/>
-          </w:tblCellMar>
-        </w:tblPrEx>
         <w:tc>
           <w:tcPr>
             <w:tcW w:w="0" w:type="auto"/>
@@ -834,12 +823,6 @@
         </w:tc>
       </w:tr>
       <w:tr>
-        <w:tblPrEx>
-          <w:tblCellMar>
-            <w:top w:w="0" w:type="dxa"/>
-            <w:bottom w:w="0" w:type="dxa"/>
-          </w:tblCellMar>
-        </w:tblPrEx>
         <w:tc>
           <w:tcPr>
             <w:tcW w:w="0" w:type="auto"/>
@@ -882,12 +865,6 @@
         </w:tc>
       </w:tr>
       <w:tr>
-        <w:tblPrEx>
-          <w:tblCellMar>
-            <w:top w:w="0" w:type="dxa"/>
-            <w:bottom w:w="0" w:type="dxa"/>
-          </w:tblCellMar>
-        </w:tblPrEx>
         <w:tc>
           <w:tcPr>
             <w:tcW w:w="0" w:type="auto"/>
@@ -930,12 +907,6 @@
         </w:tc>
       </w:tr>
       <w:tr>
-        <w:tblPrEx>
-          <w:tblCellMar>
-            <w:top w:w="0" w:type="dxa"/>
-            <w:bottom w:w="0" w:type="dxa"/>
-          </w:tblCellMar>
-        </w:tblPrEx>
         <w:tc>
           <w:tcPr>
             <w:tcW w:w="0" w:type="auto"/>
@@ -978,12 +949,6 @@
         </w:tc>
       </w:tr>
       <w:tr>
-        <w:tblPrEx>
-          <w:tblCellMar>
-            <w:top w:w="0" w:type="dxa"/>
-            <w:bottom w:w="0" w:type="dxa"/>
-          </w:tblCellMar>
-        </w:tblPrEx>
         <w:tc>
           <w:tcPr>
             <w:tcW w:w="0" w:type="auto"/>
@@ -1026,12 +991,6 @@
         </w:tc>
       </w:tr>
       <w:tr>
-        <w:tblPrEx>
-          <w:tblCellMar>
-            <w:top w:w="0" w:type="dxa"/>
-            <w:bottom w:w="0" w:type="dxa"/>
-          </w:tblCellMar>
-        </w:tblPrEx>
         <w:tc>
           <w:tcPr>
             <w:tcW w:w="0" w:type="auto"/>
@@ -1074,12 +1033,6 @@
         </w:tc>
       </w:tr>
       <w:tr>
-        <w:tblPrEx>
-          <w:tblCellMar>
-            <w:top w:w="0" w:type="dxa"/>
-            <w:bottom w:w="0" w:type="dxa"/>
-          </w:tblCellMar>
-        </w:tblPrEx>
         <w:tc>
           <w:tcPr>
             <w:tcW w:w="0" w:type="auto"/>
@@ -1175,19 +1128,8 @@
           <w:sz w:val="26"/>
           <w:szCs w:val="26"/>
         </w:rPr>
-        <w:t xml:space="preserve">Какво предлага </w:t>
-      </w:r>
-      <w:proofErr w:type="spellStart"/>
-      <w:r>
-        <w:rPr>
-          <w:b/>
-          <w:bCs/>
-          <w:sz w:val="26"/>
-          <w:szCs w:val="26"/>
-        </w:rPr>
-        <w:t>zNews</w:t>
-      </w:r>
-      <w:proofErr w:type="spellEnd"/>
+        <w:t>Какво предлага zNews</w:t>
+      </w:r>
     </w:p>
     <w:p>
       <w:pPr>
@@ -1203,23 +1145,7 @@
         <w:t xml:space="preserve">1. </w:t>
       </w:r>
       <w:r>
-        <w:t xml:space="preserve">Новини в реално време от всички краища на </w:t>
-      </w:r>
-      <w:proofErr w:type="spellStart"/>
-      <w:r>
-        <w:t>Los</w:t>
-      </w:r>
-      <w:proofErr w:type="spellEnd"/>
-      <w:r>
-        <w:t xml:space="preserve"> </w:t>
-      </w:r>
-      <w:proofErr w:type="spellStart"/>
-      <w:r>
-        <w:t>Santos</w:t>
-      </w:r>
-      <w:proofErr w:type="spellEnd"/>
-      <w:r>
-        <w:t xml:space="preserve"> с 24/7 редакционен цикъл.</w:t>
+        <w:t>Новини в реално време от всички краища на Los Santos с 24/7 редакционен цикъл.</w:t>
       </w:r>
     </w:p>
     <w:p>
@@ -1379,23 +1305,7 @@
         <w:t xml:space="preserve">1. </w:t>
       </w:r>
       <w:r>
-        <w:t xml:space="preserve">Жители на </w:t>
-      </w:r>
-      <w:proofErr w:type="spellStart"/>
-      <w:r>
-        <w:t>Los</w:t>
-      </w:r>
-      <w:proofErr w:type="spellEnd"/>
-      <w:r>
-        <w:t xml:space="preserve"> </w:t>
-      </w:r>
-      <w:proofErr w:type="spellStart"/>
-      <w:r>
-        <w:t>Santos</w:t>
-      </w:r>
-      <w:proofErr w:type="spellEnd"/>
-      <w:r>
-        <w:t>, които искат да бъдат информирани за случващото се в града.</w:t>
+        <w:t>Жители на Los Santos, които искат да бъдат информирани за случващото се в града.</w:t>
       </w:r>
     </w:p>
     <w:p>
@@ -1539,15 +1449,7 @@
         <w:t xml:space="preserve">3. </w:t>
       </w:r>
       <w:r>
-        <w:t>Бързина: Важните новини се публикуват веднага чрез системата за спешни съобщения (</w:t>
-      </w:r>
-      <w:proofErr w:type="spellStart"/>
-      <w:r>
-        <w:t>Breaking</w:t>
-      </w:r>
-      <w:proofErr w:type="spellEnd"/>
-      <w:r>
-        <w:t xml:space="preserve"> News).</w:t>
+        <w:t>Бързина: Важните новини се публикуват веднага чрез системата за спешни съобщения (Breaking News).</w:t>
       </w:r>
     </w:p>
     <w:p>
@@ -1627,29 +1529,8 @@
       <w:pPr>
         <w:spacing w:after="120" w:line="320" w:lineRule="auto"/>
       </w:pPr>
-      <w:proofErr w:type="spellStart"/>
-      <w:r>
-        <w:t>zNews</w:t>
-      </w:r>
-      <w:proofErr w:type="spellEnd"/>
-      <w:r>
-        <w:t xml:space="preserve"> е онлайн вестник с таблоиден, комикс стил, създаден да бъде разпознаваем и ангажиращ за жителите на </w:t>
-      </w:r>
-      <w:proofErr w:type="spellStart"/>
-      <w:r>
-        <w:t>Los</w:t>
-      </w:r>
-      <w:proofErr w:type="spellEnd"/>
-      <w:r>
-        <w:t xml:space="preserve"> </w:t>
-      </w:r>
-      <w:proofErr w:type="spellStart"/>
-      <w:r>
-        <w:t>Santos</w:t>
-      </w:r>
-      <w:proofErr w:type="spellEnd"/>
-      <w:r>
-        <w:t>. Порталът предлага следните основни секции:</w:t>
+      <w:r>
+        <w:t>zNews е онлайн вестник с таблоиден, комикс стил, създаден да бъде разпознаваем и ангажиращ за жителите на Los Santos. Порталът предлага следните основни секции:</w:t>
       </w:r>
     </w:p>
     <w:tbl>
@@ -1674,12 +1555,6 @@
         <w:gridCol w:w="6588"/>
       </w:tblGrid>
       <w:tr>
-        <w:tblPrEx>
-          <w:tblCellMar>
-            <w:top w:w="0" w:type="dxa"/>
-            <w:bottom w:w="0" w:type="dxa"/>
-          </w:tblCellMar>
-        </w:tblPrEx>
         <w:tc>
           <w:tcPr>
             <w:tcW w:w="0" w:type="auto"/>
@@ -1736,12 +1611,6 @@
         </w:tc>
       </w:tr>
       <w:tr>
-        <w:tblPrEx>
-          <w:tblCellMar>
-            <w:top w:w="0" w:type="dxa"/>
-            <w:bottom w:w="0" w:type="dxa"/>
-          </w:tblCellMar>
-        </w:tblPrEx>
         <w:tc>
           <w:tcPr>
             <w:tcW w:w="0" w:type="auto"/>
@@ -1784,12 +1653,6 @@
         </w:tc>
       </w:tr>
       <w:tr>
-        <w:tblPrEx>
-          <w:tblCellMar>
-            <w:top w:w="0" w:type="dxa"/>
-            <w:bottom w:w="0" w:type="dxa"/>
-          </w:tblCellMar>
-        </w:tblPrEx>
         <w:tc>
           <w:tcPr>
             <w:tcW w:w="0" w:type="auto"/>
@@ -1832,12 +1695,6 @@
         </w:tc>
       </w:tr>
       <w:tr>
-        <w:tblPrEx>
-          <w:tblCellMar>
-            <w:top w:w="0" w:type="dxa"/>
-            <w:bottom w:w="0" w:type="dxa"/>
-          </w:tblCellMar>
-        </w:tblPrEx>
         <w:tc>
           <w:tcPr>
             <w:tcW w:w="0" w:type="auto"/>
@@ -1880,12 +1737,6 @@
         </w:tc>
       </w:tr>
       <w:tr>
-        <w:tblPrEx>
-          <w:tblCellMar>
-            <w:top w:w="0" w:type="dxa"/>
-            <w:bottom w:w="0" w:type="dxa"/>
-          </w:tblCellMar>
-        </w:tblPrEx>
         <w:tc>
           <w:tcPr>
             <w:tcW w:w="0" w:type="auto"/>
@@ -1928,12 +1779,6 @@
         </w:tc>
       </w:tr>
       <w:tr>
-        <w:tblPrEx>
-          <w:tblCellMar>
-            <w:top w:w="0" w:type="dxa"/>
-            <w:bottom w:w="0" w:type="dxa"/>
-          </w:tblCellMar>
-        </w:tblPrEx>
         <w:tc>
           <w:tcPr>
             <w:tcW w:w="0" w:type="auto"/>
@@ -1976,12 +1821,6 @@
         </w:tc>
       </w:tr>
       <w:tr>
-        <w:tblPrEx>
-          <w:tblCellMar>
-            <w:top w:w="0" w:type="dxa"/>
-            <w:bottom w:w="0" w:type="dxa"/>
-          </w:tblCellMar>
-        </w:tblPrEx>
         <w:tc>
           <w:tcPr>
             <w:tcW w:w="0" w:type="auto"/>
@@ -2024,12 +1863,6 @@
         </w:tc>
       </w:tr>
       <w:tr>
-        <w:tblPrEx>
-          <w:tblCellMar>
-            <w:top w:w="0" w:type="dxa"/>
-            <w:bottom w:w="0" w:type="dxa"/>
-          </w:tblCellMar>
-        </w:tblPrEx>
         <w:tc>
           <w:tcPr>
             <w:tcW w:w="0" w:type="auto"/>
@@ -2072,48 +1905,24 @@
         </w:tc>
       </w:tr>
       <w:tr>
-        <w:tblPrEx>
-          <w:tblCellMar>
-            <w:top w:w="0" w:type="dxa"/>
-            <w:bottom w:w="0" w:type="dxa"/>
-          </w:tblCellMar>
-        </w:tblPrEx>
-        <w:tc>
-          <w:tcPr>
-            <w:tcW w:w="0" w:type="auto"/>
-            <w:tcMar>
-              <w:top w:w="60" w:type="dxa"/>
-              <w:left w:w="120" w:type="dxa"/>
-              <w:bottom w:w="60" w:type="dxa"/>
-              <w:right w:w="120" w:type="dxa"/>
-            </w:tcMar>
-          </w:tcPr>
-          <w:p>
-            <w:proofErr w:type="spellStart"/>
-            <w:r>
-              <w:rPr>
-                <w:sz w:val="20"/>
-                <w:szCs w:val="20"/>
-              </w:rPr>
-              <w:t>Most</w:t>
-            </w:r>
-            <w:proofErr w:type="spellEnd"/>
-            <w:r>
-              <w:rPr>
-                <w:sz w:val="20"/>
-                <w:szCs w:val="20"/>
-              </w:rPr>
-              <w:t xml:space="preserve"> </w:t>
-            </w:r>
-            <w:proofErr w:type="spellStart"/>
-            <w:r>
-              <w:rPr>
-                <w:sz w:val="20"/>
-                <w:szCs w:val="20"/>
-              </w:rPr>
-              <w:t>Wanted</w:t>
-            </w:r>
-            <w:proofErr w:type="spellEnd"/>
+        <w:tc>
+          <w:tcPr>
+            <w:tcW w:w="0" w:type="auto"/>
+            <w:tcMar>
+              <w:top w:w="60" w:type="dxa"/>
+              <w:left w:w="120" w:type="dxa"/>
+              <w:bottom w:w="60" w:type="dxa"/>
+              <w:right w:w="120" w:type="dxa"/>
+            </w:tcMar>
+          </w:tcPr>
+          <w:p>
+            <w:r>
+              <w:rPr>
+                <w:sz w:val="20"/>
+                <w:szCs w:val="20"/>
+              </w:rPr>
+              <w:t>Most Wanted</w:t>
+            </w:r>
           </w:p>
         </w:tc>
         <w:tc>
@@ -2230,12 +2039,6 @@
         <w:gridCol w:w="4392"/>
       </w:tblGrid>
       <w:tr>
-        <w:tblPrEx>
-          <w:tblCellMar>
-            <w:top w:w="0" w:type="dxa"/>
-            <w:bottom w:w="0" w:type="dxa"/>
-          </w:tblCellMar>
-        </w:tblPrEx>
         <w:tc>
           <w:tcPr>
             <w:tcW w:w="0" w:type="auto"/>
@@ -2319,12 +2122,6 @@
         </w:tc>
       </w:tr>
       <w:tr>
-        <w:tblPrEx>
-          <w:tblCellMar>
-            <w:top w:w="0" w:type="dxa"/>
-            <w:bottom w:w="0" w:type="dxa"/>
-          </w:tblCellMar>
-        </w:tblPrEx>
         <w:tc>
           <w:tcPr>
             <w:tcW w:w="0" w:type="auto"/>
@@ -2387,12 +2184,6 @@
         </w:tc>
       </w:tr>
       <w:tr>
-        <w:tblPrEx>
-          <w:tblCellMar>
-            <w:top w:w="0" w:type="dxa"/>
-            <w:bottom w:w="0" w:type="dxa"/>
-          </w:tblCellMar>
-        </w:tblPrEx>
         <w:tc>
           <w:tcPr>
             <w:tcW w:w="0" w:type="auto"/>
@@ -2455,12 +2246,6 @@
         </w:tc>
       </w:tr>
       <w:tr>
-        <w:tblPrEx>
-          <w:tblCellMar>
-            <w:top w:w="0" w:type="dxa"/>
-            <w:bottom w:w="0" w:type="dxa"/>
-          </w:tblCellMar>
-        </w:tblPrEx>
         <w:tc>
           <w:tcPr>
             <w:tcW w:w="0" w:type="auto"/>
@@ -2523,12 +2308,6 @@
         </w:tc>
       </w:tr>
       <w:tr>
-        <w:tblPrEx>
-          <w:tblCellMar>
-            <w:top w:w="0" w:type="dxa"/>
-            <w:bottom w:w="0" w:type="dxa"/>
-          </w:tblCellMar>
-        </w:tblPrEx>
         <w:tc>
           <w:tcPr>
             <w:tcW w:w="0" w:type="auto"/>
@@ -2591,12 +2370,6 @@
         </w:tc>
       </w:tr>
       <w:tr>
-        <w:tblPrEx>
-          <w:tblCellMar>
-            <w:top w:w="0" w:type="dxa"/>
-            <w:bottom w:w="0" w:type="dxa"/>
-          </w:tblCellMar>
-        </w:tblPrEx>
         <w:tc>
           <w:tcPr>
             <w:tcW w:w="0" w:type="auto"/>
@@ -2659,12 +2432,6 @@
         </w:tc>
       </w:tr>
       <w:tr>
-        <w:tblPrEx>
-          <w:tblCellMar>
-            <w:top w:w="0" w:type="dxa"/>
-            <w:bottom w:w="0" w:type="dxa"/>
-          </w:tblCellMar>
-        </w:tblPrEx>
         <w:tc>
           <w:tcPr>
             <w:tcW w:w="0" w:type="auto"/>
@@ -2727,12 +2494,6 @@
         </w:tc>
       </w:tr>
       <w:tr>
-        <w:tblPrEx>
-          <w:tblCellMar>
-            <w:top w:w="0" w:type="dxa"/>
-            <w:bottom w:w="0" w:type="dxa"/>
-          </w:tblCellMar>
-        </w:tblPrEx>
         <w:tc>
           <w:tcPr>
             <w:tcW w:w="0" w:type="auto"/>
@@ -2795,12 +2556,6 @@
         </w:tc>
       </w:tr>
       <w:tr>
-        <w:tblPrEx>
-          <w:tblCellMar>
-            <w:top w:w="0" w:type="dxa"/>
-            <w:bottom w:w="0" w:type="dxa"/>
-          </w:tblCellMar>
-        </w:tblPrEx>
         <w:tc>
           <w:tcPr>
             <w:tcW w:w="0" w:type="auto"/>
@@ -2897,15 +2652,7 @@
         <w:spacing w:after="120" w:line="320" w:lineRule="auto"/>
       </w:pPr>
       <w:r>
-        <w:t>Обяви за работа (/</w:t>
-      </w:r>
-      <w:proofErr w:type="spellStart"/>
-      <w:r>
-        <w:t>jobs</w:t>
-      </w:r>
-      <w:proofErr w:type="spellEnd"/>
-      <w:r>
-        <w:t>)</w:t>
+        <w:t>Обяви за работа (/jobs)</w:t>
       </w:r>
     </w:p>
     <w:p>
@@ -2913,23 +2660,7 @@
         <w:spacing w:after="120" w:line="320" w:lineRule="auto"/>
       </w:pPr>
       <w:r>
-        <w:t xml:space="preserve">Централизирана дъска за обяви за работа от легални работодатели в </w:t>
-      </w:r>
-      <w:proofErr w:type="spellStart"/>
-      <w:r>
-        <w:t>Los</w:t>
-      </w:r>
-      <w:proofErr w:type="spellEnd"/>
-      <w:r>
-        <w:t xml:space="preserve"> </w:t>
-      </w:r>
-      <w:proofErr w:type="spellStart"/>
-      <w:r>
-        <w:t>Santos</w:t>
-      </w:r>
-      <w:proofErr w:type="spellEnd"/>
-      <w:r>
-        <w:t>. Поддържат се следните типове позиции:</w:t>
+        <w:t>Централизирана дъска за обяви за работа от легални работодатели в Los Santos. Поддържат се следните типове позиции:</w:t>
       </w:r>
     </w:p>
     <w:tbl>
@@ -2954,12 +2685,6 @@
         <w:gridCol w:w="6108"/>
       </w:tblGrid>
       <w:tr>
-        <w:tblPrEx>
-          <w:tblCellMar>
-            <w:top w:w="0" w:type="dxa"/>
-            <w:bottom w:w="0" w:type="dxa"/>
-          </w:tblCellMar>
-        </w:tblPrEx>
         <w:tc>
           <w:tcPr>
             <w:tcW w:w="0" w:type="auto"/>
@@ -3016,12 +2741,6 @@
         </w:tc>
       </w:tr>
       <w:tr>
-        <w:tblPrEx>
-          <w:tblCellMar>
-            <w:top w:w="0" w:type="dxa"/>
-            <w:bottom w:w="0" w:type="dxa"/>
-          </w:tblCellMar>
-        </w:tblPrEx>
         <w:tc>
           <w:tcPr>
             <w:tcW w:w="0" w:type="auto"/>
@@ -3064,12 +2783,6 @@
         </w:tc>
       </w:tr>
       <w:tr>
-        <w:tblPrEx>
-          <w:tblCellMar>
-            <w:top w:w="0" w:type="dxa"/>
-            <w:bottom w:w="0" w:type="dxa"/>
-          </w:tblCellMar>
-        </w:tblPrEx>
         <w:tc>
           <w:tcPr>
             <w:tcW w:w="0" w:type="auto"/>
@@ -3112,12 +2825,6 @@
         </w:tc>
       </w:tr>
       <w:tr>
-        <w:tblPrEx>
-          <w:tblCellMar>
-            <w:top w:w="0" w:type="dxa"/>
-            <w:bottom w:w="0" w:type="dxa"/>
-          </w:tblCellMar>
-        </w:tblPrEx>
         <w:tc>
           <w:tcPr>
             <w:tcW w:w="0" w:type="auto"/>
@@ -3160,12 +2867,6 @@
         </w:tc>
       </w:tr>
       <w:tr>
-        <w:tblPrEx>
-          <w:tblCellMar>
-            <w:top w:w="0" w:type="dxa"/>
-            <w:bottom w:w="0" w:type="dxa"/>
-          </w:tblCellMar>
-        </w:tblPrEx>
         <w:tc>
           <w:tcPr>
             <w:tcW w:w="0" w:type="auto"/>
@@ -3215,12 +2916,6 @@
         </w:tc>
       </w:tr>
       <w:tr>
-        <w:tblPrEx>
-          <w:tblCellMar>
-            <w:top w:w="0" w:type="dxa"/>
-            <w:bottom w:w="0" w:type="dxa"/>
-          </w:tblCellMar>
-        </w:tblPrEx>
         <w:tc>
           <w:tcPr>
             <w:tcW w:w="0" w:type="auto"/>
@@ -3263,12 +2958,6 @@
         </w:tc>
       </w:tr>
       <w:tr>
-        <w:tblPrEx>
-          <w:tblCellMar>
-            <w:top w:w="0" w:type="dxa"/>
-            <w:bottom w:w="0" w:type="dxa"/>
-          </w:tblCellMar>
-        </w:tblPrEx>
         <w:tc>
           <w:tcPr>
             <w:tcW w:w="0" w:type="auto"/>
@@ -3322,15 +3011,7 @@
       </w:pPr>
       <w:r>
         <w:lastRenderedPageBreak/>
-        <w:t>Съдебни хроники (/</w:t>
-      </w:r>
-      <w:proofErr w:type="spellStart"/>
-      <w:r>
-        <w:t>court</w:t>
-      </w:r>
-      <w:proofErr w:type="spellEnd"/>
-      <w:r>
-        <w:t>)</w:t>
+        <w:t>Съдебни хроники (/court)</w:t>
       </w:r>
     </w:p>
     <w:p>
@@ -3338,23 +3019,7 @@
         <w:spacing w:after="120" w:line="320" w:lineRule="auto"/>
       </w:pPr>
       <w:r>
-        <w:t xml:space="preserve">Публичен регистър на съдебните дела в </w:t>
-      </w:r>
-      <w:proofErr w:type="spellStart"/>
-      <w:r>
-        <w:t>Los</w:t>
-      </w:r>
-      <w:proofErr w:type="spellEnd"/>
-      <w:r>
-        <w:t xml:space="preserve"> </w:t>
-      </w:r>
-      <w:proofErr w:type="spellStart"/>
-      <w:r>
-        <w:t>Santos</w:t>
-      </w:r>
-      <w:proofErr w:type="spellEnd"/>
-      <w:r>
-        <w:t xml:space="preserve"> с три статуса: насрочени, текущи и приключени. Всяко дело има ниво на тежест и обобщение на обвиненията и присъдите.</w:t>
+        <w:t>Публичен регистър на съдебните дела в Los Santos с три статуса: насрочени, текущи и приключени. Всяко дело има ниво на тежест и обобщение на обвиненията и присъдите.</w:t>
       </w:r>
     </w:p>
     <w:p>
@@ -3362,15 +3027,7 @@
         <w:spacing w:after="120" w:line="320" w:lineRule="auto"/>
       </w:pPr>
       <w:r>
-        <w:t>Събития (/</w:t>
-      </w:r>
-      <w:proofErr w:type="spellStart"/>
-      <w:r>
-        <w:t>events</w:t>
-      </w:r>
-      <w:proofErr w:type="spellEnd"/>
-      <w:r>
-        <w:t>)</w:t>
+        <w:t>Събития (/events)</w:t>
       </w:r>
     </w:p>
     <w:p>
@@ -3386,15 +3043,7 @@
         <w:spacing w:after="120" w:line="320" w:lineRule="auto"/>
       </w:pPr>
       <w:r>
-        <w:t>Фотогалерия (/</w:t>
-      </w:r>
-      <w:proofErr w:type="spellStart"/>
-      <w:r>
-        <w:t>gallery</w:t>
-      </w:r>
-      <w:proofErr w:type="spellEnd"/>
-      <w:r>
-        <w:t>)</w:t>
+        <w:t>Фотогалерия (/gallery)</w:t>
       </w:r>
     </w:p>
     <w:p>
@@ -3402,15 +3051,7 @@
         <w:spacing w:after="120" w:line="320" w:lineRule="auto"/>
       </w:pPr>
       <w:r>
-        <w:t xml:space="preserve">Визуална библиотека от репортажни снимки, организирани по категории, с филтриране и </w:t>
-      </w:r>
-      <w:proofErr w:type="spellStart"/>
-      <w:r>
-        <w:t>lightbox</w:t>
-      </w:r>
-      <w:proofErr w:type="spellEnd"/>
-      <w:r>
-        <w:t xml:space="preserve"> преглед.</w:t>
+        <w:t>Визуална библиотека от репортажни снимки, организирани по категории, с филтриране и lightbox преглед.</w:t>
       </w:r>
     </w:p>
     <w:p>
@@ -3500,23 +3141,7 @@
         <w:t xml:space="preserve">2. </w:t>
       </w:r>
       <w:r>
-        <w:t xml:space="preserve">Страничен банер в </w:t>
-      </w:r>
-      <w:proofErr w:type="spellStart"/>
-      <w:r>
-        <w:t>sidebar</w:t>
-      </w:r>
-      <w:proofErr w:type="spellEnd"/>
-      <w:r>
-        <w:t xml:space="preserve"> секцията (винаги видим при </w:t>
-      </w:r>
-      <w:proofErr w:type="spellStart"/>
-      <w:r>
-        <w:t>скролиране</w:t>
-      </w:r>
-      <w:proofErr w:type="spellEnd"/>
-      <w:r>
-        <w:t>).</w:t>
+        <w:t>Страничен банер в sidebar секцията (винаги видим при скролиране).</w:t>
       </w:r>
     </w:p>
     <w:p>
@@ -3596,17 +3221,11 @@
       </w:tblPr>
       <w:tblGrid>
         <w:gridCol w:w="1018"/>
-        <w:gridCol w:w="3647"/>
+        <w:gridCol w:w="4371"/>
         <w:gridCol w:w="2060"/>
-        <w:gridCol w:w="1717"/>
+        <w:gridCol w:w="993"/>
       </w:tblGrid>
       <w:tr>
-        <w:tblPrEx>
-          <w:tblCellMar>
-            <w:top w:w="0" w:type="dxa"/>
-            <w:bottom w:w="0" w:type="dxa"/>
-          </w:tblCellMar>
-        </w:tblPrEx>
         <w:tc>
           <w:tcPr>
             <w:tcW w:w="0" w:type="auto"/>
@@ -3711,30 +3330,23 @@
                 <w:sz w:val="20"/>
                 <w:szCs w:val="20"/>
               </w:rPr>
-              <w:t>Цена (примерна)</w:t>
+              <w:t>Цена</w:t>
             </w:r>
           </w:p>
         </w:tc>
       </w:tr>
       <w:tr>
-        <w:tblPrEx>
-          <w:tblCellMar>
-            <w:top w:w="0" w:type="dxa"/>
-            <w:bottom w:w="0" w:type="dxa"/>
-          </w:tblCellMar>
-        </w:tblPrEx>
-        <w:tc>
-          <w:tcPr>
-            <w:tcW w:w="0" w:type="auto"/>
-            <w:tcMar>
-              <w:top w:w="60" w:type="dxa"/>
-              <w:left w:w="120" w:type="dxa"/>
-              <w:bottom w:w="60" w:type="dxa"/>
-              <w:right w:w="120" w:type="dxa"/>
-            </w:tcMar>
-          </w:tcPr>
-          <w:p>
-            <w:proofErr w:type="spellStart"/>
+        <w:tc>
+          <w:tcPr>
+            <w:tcW w:w="0" w:type="auto"/>
+            <w:tcMar>
+              <w:top w:w="60" w:type="dxa"/>
+              <w:left w:w="120" w:type="dxa"/>
+              <w:bottom w:w="60" w:type="dxa"/>
+              <w:right w:w="120" w:type="dxa"/>
+            </w:tcMar>
+          </w:tcPr>
+          <w:p>
             <w:r>
               <w:rPr>
                 <w:sz w:val="20"/>
@@ -3742,7 +3354,6 @@
               </w:rPr>
               <w:t>Bronze</w:t>
             </w:r>
-            <w:proofErr w:type="spellEnd"/>
           </w:p>
         </w:tc>
         <w:tc>
@@ -3801,30 +3412,23 @@
                 <w:sz w:val="20"/>
                 <w:szCs w:val="20"/>
               </w:rPr>
-              <w:t>$300/седмица</w:t>
+              <w:t>Варира*</w:t>
             </w:r>
           </w:p>
         </w:tc>
       </w:tr>
       <w:tr>
-        <w:tblPrEx>
-          <w:tblCellMar>
-            <w:top w:w="0" w:type="dxa"/>
-            <w:bottom w:w="0" w:type="dxa"/>
-          </w:tblCellMar>
-        </w:tblPrEx>
-        <w:tc>
-          <w:tcPr>
-            <w:tcW w:w="0" w:type="auto"/>
-            <w:tcMar>
-              <w:top w:w="60" w:type="dxa"/>
-              <w:left w:w="120" w:type="dxa"/>
-              <w:bottom w:w="60" w:type="dxa"/>
-              <w:right w:w="120" w:type="dxa"/>
-            </w:tcMar>
-          </w:tcPr>
-          <w:p>
-            <w:proofErr w:type="spellStart"/>
+        <w:tc>
+          <w:tcPr>
+            <w:tcW w:w="0" w:type="auto"/>
+            <w:tcMar>
+              <w:top w:w="60" w:type="dxa"/>
+              <w:left w:w="120" w:type="dxa"/>
+              <w:bottom w:w="60" w:type="dxa"/>
+              <w:right w:w="120" w:type="dxa"/>
+            </w:tcMar>
+          </w:tcPr>
+          <w:p>
             <w:r>
               <w:rPr>
                 <w:sz w:val="20"/>
@@ -3832,7 +3436,6 @@
               </w:rPr>
               <w:t>Silver</w:t>
             </w:r>
-            <w:proofErr w:type="spellEnd"/>
           </w:p>
         </w:tc>
         <w:tc>
@@ -3891,30 +3494,23 @@
                 <w:sz w:val="20"/>
                 <w:szCs w:val="20"/>
               </w:rPr>
-              <w:t>$500/2 седмици</w:t>
+              <w:t>Варира*</w:t>
             </w:r>
           </w:p>
         </w:tc>
       </w:tr>
       <w:tr>
-        <w:tblPrEx>
-          <w:tblCellMar>
-            <w:top w:w="0" w:type="dxa"/>
-            <w:bottom w:w="0" w:type="dxa"/>
-          </w:tblCellMar>
-        </w:tblPrEx>
-        <w:tc>
-          <w:tcPr>
-            <w:tcW w:w="0" w:type="auto"/>
-            <w:tcMar>
-              <w:top w:w="60" w:type="dxa"/>
-              <w:left w:w="120" w:type="dxa"/>
-              <w:bottom w:w="60" w:type="dxa"/>
-              <w:right w:w="120" w:type="dxa"/>
-            </w:tcMar>
-          </w:tcPr>
-          <w:p>
-            <w:proofErr w:type="spellStart"/>
+        <w:tc>
+          <w:tcPr>
+            <w:tcW w:w="0" w:type="auto"/>
+            <w:tcMar>
+              <w:top w:w="60" w:type="dxa"/>
+              <w:left w:w="120" w:type="dxa"/>
+              <w:bottom w:w="60" w:type="dxa"/>
+              <w:right w:w="120" w:type="dxa"/>
+            </w:tcMar>
+          </w:tcPr>
+          <w:p>
             <w:r>
               <w:rPr>
                 <w:sz w:val="20"/>
@@ -3922,7 +3518,6 @@
               </w:rPr>
               <w:t>Gold</w:t>
             </w:r>
-            <w:proofErr w:type="spellEnd"/>
           </w:p>
         </w:tc>
         <w:tc>
@@ -3981,18 +3576,12 @@
                 <w:sz w:val="20"/>
                 <w:szCs w:val="20"/>
               </w:rPr>
-              <w:t>$900/месец</w:t>
+              <w:t>Варира*</w:t>
             </w:r>
           </w:p>
         </w:tc>
       </w:tr>
       <w:tr>
-        <w:tblPrEx>
-          <w:tblCellMar>
-            <w:top w:w="0" w:type="dxa"/>
-            <w:bottom w:w="0" w:type="dxa"/>
-          </w:tblCellMar>
-        </w:tblPrEx>
         <w:tc>
           <w:tcPr>
             <w:tcW w:w="0" w:type="auto"/>
@@ -4029,23 +3618,7 @@
                 <w:sz w:val="20"/>
                 <w:szCs w:val="20"/>
               </w:rPr>
-              <w:t xml:space="preserve">Всичко от </w:t>
-            </w:r>
-            <w:proofErr w:type="spellStart"/>
-            <w:r>
-              <w:rPr>
-                <w:sz w:val="20"/>
-                <w:szCs w:val="20"/>
-              </w:rPr>
-              <w:t>Gold</w:t>
-            </w:r>
-            <w:proofErr w:type="spellEnd"/>
-            <w:r>
-              <w:rPr>
-                <w:sz w:val="20"/>
-                <w:szCs w:val="20"/>
-              </w:rPr>
-              <w:t xml:space="preserve"> + спонсорирана статия + брандиране на секция</w:t>
+              <w:t>Всичко от Gold + спонсорирана статия + брандиране на секция</w:t>
             </w:r>
           </w:p>
         </w:tc>
@@ -4085,12 +3658,26 @@
                 <w:sz w:val="20"/>
                 <w:szCs w:val="20"/>
               </w:rPr>
-              <w:t>$1,500/месец</w:t>
+              <w:t>Варира*</w:t>
             </w:r>
           </w:p>
         </w:tc>
       </w:tr>
     </w:tbl>
+    <w:p>
+      <w:pPr>
+        <w:spacing w:before="120" w:after="120"/>
+      </w:pPr>
+      <w:r>
+        <w:rPr>
+          <w:i/>
+          <w:iCs/>
+          <w:sz w:val="20"/>
+          <w:szCs w:val="20"/>
+        </w:rPr>
+        <w:t>* Цените варират в зависимост от посещенията на сайта и се актуализират периодично.</w:t>
+      </w:r>
+    </w:p>
     <w:p>
       <w:pPr>
         <w:spacing w:after="120"/>
@@ -4142,23 +3729,7 @@
         <w:ind w:left="576"/>
       </w:pPr>
       <w:r>
-        <w:t xml:space="preserve">Висока видимост сред активната общност на </w:t>
-      </w:r>
-      <w:proofErr w:type="spellStart"/>
-      <w:r>
-        <w:t>Los</w:t>
-      </w:r>
-      <w:proofErr w:type="spellEnd"/>
-      <w:r>
-        <w:t xml:space="preserve"> </w:t>
-      </w:r>
-      <w:proofErr w:type="spellStart"/>
-      <w:r>
-        <w:t>Santos</w:t>
-      </w:r>
-      <w:proofErr w:type="spellEnd"/>
-      <w:r>
-        <w:t>.</w:t>
+        <w:t>Висока видимост сред активната общност на Los Santos.</w:t>
       </w:r>
     </w:p>
     <w:p>
@@ -4240,15 +3811,7 @@
         <w:spacing w:after="120" w:line="320" w:lineRule="auto"/>
       </w:pPr>
       <w:r>
-        <w:t xml:space="preserve">Освен новинарско покритие, </w:t>
-      </w:r>
-      <w:proofErr w:type="spellStart"/>
-      <w:r>
-        <w:t>zNews</w:t>
-      </w:r>
-      <w:proofErr w:type="spellEnd"/>
-      <w:r>
-        <w:t xml:space="preserve"> изпълнява и функцията на обществен информационен хъб за града:</w:t>
+        <w:t>Освен новинарско покритие, zNews изпълнява и функцията на обществен информационен хъб за града:</w:t>
       </w:r>
     </w:p>
     <w:tbl>
@@ -4274,12 +3837,6 @@
         <w:gridCol w:w="3718"/>
       </w:tblGrid>
       <w:tr>
-        <w:tblPrEx>
-          <w:tblCellMar>
-            <w:top w:w="0" w:type="dxa"/>
-            <w:bottom w:w="0" w:type="dxa"/>
-          </w:tblCellMar>
-        </w:tblPrEx>
         <w:tc>
           <w:tcPr>
             <w:tcW w:w="0" w:type="auto"/>
@@ -4363,12 +3920,6 @@
         </w:tc>
       </w:tr>
       <w:tr>
-        <w:tblPrEx>
-          <w:tblCellMar>
-            <w:top w:w="0" w:type="dxa"/>
-            <w:bottom w:w="0" w:type="dxa"/>
-          </w:tblCellMar>
-        </w:tblPrEx>
         <w:tc>
           <w:tcPr>
             <w:tcW w:w="0" w:type="auto"/>
@@ -4431,12 +3982,6 @@
         </w:tc>
       </w:tr>
       <w:tr>
-        <w:tblPrEx>
-          <w:tblCellMar>
-            <w:top w:w="0" w:type="dxa"/>
-            <w:bottom w:w="0" w:type="dxa"/>
-          </w:tblCellMar>
-        </w:tblPrEx>
         <w:tc>
           <w:tcPr>
             <w:tcW w:w="0" w:type="auto"/>
@@ -4499,48 +4044,24 @@
         </w:tc>
       </w:tr>
       <w:tr>
-        <w:tblPrEx>
-          <w:tblCellMar>
-            <w:top w:w="0" w:type="dxa"/>
-            <w:bottom w:w="0" w:type="dxa"/>
-          </w:tblCellMar>
-        </w:tblPrEx>
-        <w:tc>
-          <w:tcPr>
-            <w:tcW w:w="0" w:type="auto"/>
-            <w:tcMar>
-              <w:top w:w="60" w:type="dxa"/>
-              <w:left w:w="120" w:type="dxa"/>
-              <w:bottom w:w="60" w:type="dxa"/>
-              <w:right w:w="120" w:type="dxa"/>
-            </w:tcMar>
-          </w:tcPr>
-          <w:p>
-            <w:proofErr w:type="spellStart"/>
-            <w:r>
-              <w:rPr>
-                <w:sz w:val="20"/>
-                <w:szCs w:val="20"/>
-              </w:rPr>
-              <w:t>Most</w:t>
-            </w:r>
-            <w:proofErr w:type="spellEnd"/>
-            <w:r>
-              <w:rPr>
-                <w:sz w:val="20"/>
-                <w:szCs w:val="20"/>
-              </w:rPr>
-              <w:t xml:space="preserve"> </w:t>
-            </w:r>
-            <w:proofErr w:type="spellStart"/>
-            <w:r>
-              <w:rPr>
-                <w:sz w:val="20"/>
-                <w:szCs w:val="20"/>
-              </w:rPr>
-              <w:t>Wanted</w:t>
-            </w:r>
-            <w:proofErr w:type="spellEnd"/>
+        <w:tc>
+          <w:tcPr>
+            <w:tcW w:w="0" w:type="auto"/>
+            <w:tcMar>
+              <w:top w:w="60" w:type="dxa"/>
+              <w:left w:w="120" w:type="dxa"/>
+              <w:bottom w:w="60" w:type="dxa"/>
+              <w:right w:w="120" w:type="dxa"/>
+            </w:tcMar>
+          </w:tcPr>
+          <w:p>
+            <w:r>
+              <w:rPr>
+                <w:sz w:val="20"/>
+                <w:szCs w:val="20"/>
+              </w:rPr>
+              <w:t>Most Wanted</w:t>
+            </w:r>
           </w:p>
         </w:tc>
         <w:tc>
@@ -4585,12 +4106,6 @@
         </w:tc>
       </w:tr>
       <w:tr>
-        <w:tblPrEx>
-          <w:tblCellMar>
-            <w:top w:w="0" w:type="dxa"/>
-            <w:bottom w:w="0" w:type="dxa"/>
-          </w:tblCellMar>
-        </w:tblPrEx>
         <w:tc>
           <w:tcPr>
             <w:tcW w:w="0" w:type="auto"/>
@@ -4653,12 +4168,6 @@
         </w:tc>
       </w:tr>
       <w:tr>
-        <w:tblPrEx>
-          <w:tblCellMar>
-            <w:top w:w="0" w:type="dxa"/>
-            <w:bottom w:w="0" w:type="dxa"/>
-          </w:tblCellMar>
-        </w:tblPrEx>
         <w:tc>
           <w:tcPr>
             <w:tcW w:w="0" w:type="auto"/>
@@ -4731,7 +4240,6 @@
         <w:pBdr>
           <w:left w:val="single" w:sz="12" w:space="0" w:color="E87420"/>
         </w:pBdr>
-        <w:shd w:val="clear" w:color="auto" w:fill="FFF3CD"/>
         <w:spacing w:before="150" w:after="150"/>
         <w:ind w:left="431" w:right="431"/>
       </w:pPr>
@@ -4743,21 +4251,12 @@
         </w:rPr>
         <w:t xml:space="preserve">⚠ </w:t>
       </w:r>
-      <w:proofErr w:type="spellStart"/>
       <w:r>
         <w:rPr>
           <w:i/>
           <w:iCs/>
         </w:rPr>
-        <w:t>zNews</w:t>
-      </w:r>
-      <w:proofErr w:type="spellEnd"/>
-      <w:r>
-        <w:rPr>
-          <w:i/>
-          <w:iCs/>
-        </w:rPr>
-        <w:t xml:space="preserve"> не се ангажира с интересите на конкретни фракции. Обществените услуги са достъпни за всички легални организации и граждани.</w:t>
+        <w:t>zNews не се ангажира с интересите на конкретни фракции. Обществените услуги са достъпни за всички легални организации и граждани.</w:t>
       </w:r>
     </w:p>
     <w:p>
@@ -4838,12 +4337,6 @@
         <w:gridCol w:w="6190"/>
       </w:tblGrid>
       <w:tr>
-        <w:tblPrEx>
-          <w:tblCellMar>
-            <w:top w:w="0" w:type="dxa"/>
-            <w:bottom w:w="0" w:type="dxa"/>
-          </w:tblCellMar>
-        </w:tblPrEx>
         <w:tc>
           <w:tcPr>
             <w:tcW w:w="0" w:type="auto"/>
@@ -4900,12 +4393,6 @@
         </w:tc>
       </w:tr>
       <w:tr>
-        <w:tblPrEx>
-          <w:tblCellMar>
-            <w:top w:w="0" w:type="dxa"/>
-            <w:bottom w:w="0" w:type="dxa"/>
-          </w:tblCellMar>
-        </w:tblPrEx>
         <w:tc>
           <w:tcPr>
             <w:tcW w:w="0" w:type="auto"/>
@@ -4948,12 +4435,6 @@
         </w:tc>
       </w:tr>
       <w:tr>
-        <w:tblPrEx>
-          <w:tblCellMar>
-            <w:top w:w="0" w:type="dxa"/>
-            <w:bottom w:w="0" w:type="dxa"/>
-          </w:tblCellMar>
-        </w:tblPrEx>
         <w:tc>
           <w:tcPr>
             <w:tcW w:w="0" w:type="auto"/>
@@ -4996,12 +4477,6 @@
         </w:tc>
       </w:tr>
       <w:tr>
-        <w:tblPrEx>
-          <w:tblCellMar>
-            <w:top w:w="0" w:type="dxa"/>
-            <w:bottom w:w="0" w:type="dxa"/>
-          </w:tblCellMar>
-        </w:tblPrEx>
         <w:tc>
           <w:tcPr>
             <w:tcW w:w="0" w:type="auto"/>
@@ -5044,12 +4519,6 @@
         </w:tc>
       </w:tr>
       <w:tr>
-        <w:tblPrEx>
-          <w:tblCellMar>
-            <w:top w:w="0" w:type="dxa"/>
-            <w:bottom w:w="0" w:type="dxa"/>
-          </w:tblCellMar>
-        </w:tblPrEx>
         <w:tc>
           <w:tcPr>
             <w:tcW w:w="0" w:type="auto"/>
@@ -5093,12 +4562,6 @@
         </w:tc>
       </w:tr>
       <w:tr>
-        <w:tblPrEx>
-          <w:tblCellMar>
-            <w:top w:w="0" w:type="dxa"/>
-            <w:bottom w:w="0" w:type="dxa"/>
-          </w:tblCellMar>
-        </w:tblPrEx>
         <w:tc>
           <w:tcPr>
             <w:tcW w:w="0" w:type="auto"/>
@@ -5141,12 +4604,6 @@
         </w:tc>
       </w:tr>
       <w:tr>
-        <w:tblPrEx>
-          <w:tblCellMar>
-            <w:top w:w="0" w:type="dxa"/>
-            <w:bottom w:w="0" w:type="dxa"/>
-          </w:tblCellMar>
-        </w:tblPrEx>
         <w:tc>
           <w:tcPr>
             <w:tcW w:w="0" w:type="auto"/>
@@ -5300,15 +4757,7 @@
         <w:t xml:space="preserve">5. </w:t>
       </w:r>
       <w:r>
-        <w:t xml:space="preserve">При спешни новини се използва системата за </w:t>
-      </w:r>
-      <w:proofErr w:type="spellStart"/>
-      <w:r>
-        <w:t>Breaking</w:t>
-      </w:r>
-      <w:proofErr w:type="spellEnd"/>
-      <w:r>
-        <w:t xml:space="preserve"> News за незабавно излъчване.</w:t>
+        <w:t>При спешни новини се използва системата за Breaking News за незабавно излъчване.</w:t>
       </w:r>
     </w:p>
     <w:p>
@@ -5606,15 +5055,7 @@
         <w:spacing w:after="120" w:line="320" w:lineRule="auto"/>
       </w:pPr>
       <w:r>
-        <w:t xml:space="preserve">Журналистите на </w:t>
-      </w:r>
-      <w:proofErr w:type="spellStart"/>
-      <w:r>
-        <w:t>zNews</w:t>
-      </w:r>
-      <w:proofErr w:type="spellEnd"/>
-      <w:r>
-        <w:t xml:space="preserve"> нямат право да отразяват теми, в които имат пряк личен или бизнес интерес. Рекламодателите нямат влияние върху редакционното съдържание. Всяко нарушение се санкционира от главния редактор.</w:t>
+        <w:t>Журналистите на zNews нямат право да отразяват теми, в които имат пряк личен или бизнес интерес. Рекламодателите нямат влияние върху редакционното съдържание. Всяко нарушение се санкционира от главния редактор.</w:t>
       </w:r>
     </w:p>
     <w:p>
@@ -5670,47 +5111,15 @@
           <w:sz w:val="26"/>
           <w:szCs w:val="26"/>
         </w:rPr>
-        <w:t xml:space="preserve">Как работи </w:t>
-      </w:r>
-      <w:proofErr w:type="spellStart"/>
-      <w:r>
-        <w:rPr>
-          <w:b/>
-          <w:bCs/>
-          <w:sz w:val="26"/>
-          <w:szCs w:val="26"/>
-        </w:rPr>
-        <w:t>zNews</w:t>
-      </w:r>
-      <w:proofErr w:type="spellEnd"/>
+        <w:t>Как работи zNews</w:t>
+      </w:r>
     </w:p>
     <w:p>
       <w:pPr>
         <w:spacing w:after="120" w:line="320" w:lineRule="auto"/>
       </w:pPr>
-      <w:proofErr w:type="spellStart"/>
-      <w:r>
-        <w:t>zNews</w:t>
-      </w:r>
-      <w:proofErr w:type="spellEnd"/>
-      <w:r>
-        <w:t xml:space="preserve"> функционира като онлайн вестник, достъпен 24 часа в денонощието за всички жители на </w:t>
-      </w:r>
-      <w:proofErr w:type="spellStart"/>
-      <w:r>
-        <w:t>Los</w:t>
-      </w:r>
-      <w:proofErr w:type="spellEnd"/>
-      <w:r>
-        <w:t xml:space="preserve"> </w:t>
-      </w:r>
-      <w:proofErr w:type="spellStart"/>
-      <w:r>
-        <w:t>Santos</w:t>
-      </w:r>
-      <w:proofErr w:type="spellEnd"/>
-      <w:r>
-        <w:t>. Платформата е проектирана да бъде бърза, лесна за навигация и достъпна от всяко устройство.</w:t>
+      <w:r>
+        <w:t>zNews функционира като онлайн вестник, достъпен 24 часа в денонощието за всички жители на Los Santos. Платформата е проектирана да бъде бърза, лесна за навигация и достъпна от всяко устройство.</w:t>
       </w:r>
     </w:p>
     <w:tbl>
@@ -5735,12 +5144,6 @@
         <w:gridCol w:w="6767"/>
       </w:tblGrid>
       <w:tr>
-        <w:tblPrEx>
-          <w:tblCellMar>
-            <w:top w:w="0" w:type="dxa"/>
-            <w:bottom w:w="0" w:type="dxa"/>
-          </w:tblCellMar>
-        </w:tblPrEx>
         <w:tc>
           <w:tcPr>
             <w:tcW w:w="0" w:type="auto"/>
@@ -5797,12 +5200,6 @@
         </w:tc>
       </w:tr>
       <w:tr>
-        <w:tblPrEx>
-          <w:tblCellMar>
-            <w:top w:w="0" w:type="dxa"/>
-            <w:bottom w:w="0" w:type="dxa"/>
-          </w:tblCellMar>
-        </w:tblPrEx>
         <w:tc>
           <w:tcPr>
             <w:tcW w:w="0" w:type="auto"/>
@@ -5839,43 +5236,12 @@
                 <w:sz w:val="20"/>
                 <w:szCs w:val="20"/>
               </w:rPr>
-              <w:t xml:space="preserve">Централен портал за новини, достъпен за всеки гражданин на </w:t>
-            </w:r>
-            <w:proofErr w:type="spellStart"/>
-            <w:r>
-              <w:rPr>
-                <w:sz w:val="20"/>
-                <w:szCs w:val="20"/>
-              </w:rPr>
-              <w:t>Los</w:t>
-            </w:r>
-            <w:proofErr w:type="spellEnd"/>
-            <w:r>
-              <w:rPr>
-                <w:sz w:val="20"/>
-                <w:szCs w:val="20"/>
-              </w:rPr>
-              <w:t xml:space="preserve"> </w:t>
-            </w:r>
-            <w:proofErr w:type="spellStart"/>
-            <w:r>
-              <w:rPr>
-                <w:sz w:val="20"/>
-                <w:szCs w:val="20"/>
-              </w:rPr>
-              <w:t>Santos</w:t>
-            </w:r>
-            <w:proofErr w:type="spellEnd"/>
+              <w:t>Централен портал за новини, достъпен за всеки гражданин на Los Santos</w:t>
+            </w:r>
           </w:p>
         </w:tc>
       </w:tr>
       <w:tr>
-        <w:tblPrEx>
-          <w:tblCellMar>
-            <w:top w:w="0" w:type="dxa"/>
-            <w:bottom w:w="0" w:type="dxa"/>
-          </w:tblCellMar>
-        </w:tblPrEx>
         <w:tc>
           <w:tcPr>
             <w:tcW w:w="0" w:type="auto"/>
@@ -5912,34 +5278,12 @@
                 <w:sz w:val="20"/>
                 <w:szCs w:val="20"/>
               </w:rPr>
-              <w:t>Система за моментално разпространение на важни съобщения (</w:t>
-            </w:r>
-            <w:proofErr w:type="spellStart"/>
-            <w:r>
-              <w:rPr>
-                <w:sz w:val="20"/>
-                <w:szCs w:val="20"/>
-              </w:rPr>
-              <w:t>Breaking</w:t>
-            </w:r>
-            <w:proofErr w:type="spellEnd"/>
-            <w:r>
-              <w:rPr>
-                <w:sz w:val="20"/>
-                <w:szCs w:val="20"/>
-              </w:rPr>
-              <w:t xml:space="preserve"> News)</w:t>
+              <w:t>Система за моментално разпространение на важни съобщения (Breaking News)</w:t>
             </w:r>
           </w:p>
         </w:tc>
       </w:tr>
       <w:tr>
-        <w:tblPrEx>
-          <w:tblCellMar>
-            <w:top w:w="0" w:type="dxa"/>
-            <w:bottom w:w="0" w:type="dxa"/>
-          </w:tblCellMar>
-        </w:tblPrEx>
         <w:tc>
           <w:tcPr>
             <w:tcW w:w="0" w:type="auto"/>
@@ -5982,12 +5326,6 @@
         </w:tc>
       </w:tr>
       <w:tr>
-        <w:tblPrEx>
-          <w:tblCellMar>
-            <w:top w:w="0" w:type="dxa"/>
-            <w:bottom w:w="0" w:type="dxa"/>
-          </w:tblCellMar>
-        </w:tblPrEx>
         <w:tc>
           <w:tcPr>
             <w:tcW w:w="0" w:type="auto"/>
@@ -6030,12 +5368,6 @@
         </w:tc>
       </w:tr>
       <w:tr>
-        <w:tblPrEx>
-          <w:tblCellMar>
-            <w:top w:w="0" w:type="dxa"/>
-            <w:bottom w:w="0" w:type="dxa"/>
-          </w:tblCellMar>
-        </w:tblPrEx>
         <w:tc>
           <w:tcPr>
             <w:tcW w:w="0" w:type="auto"/>
@@ -6078,12 +5410,6 @@
         </w:tc>
       </w:tr>
       <w:tr>
-        <w:tblPrEx>
-          <w:tblCellMar>
-            <w:top w:w="0" w:type="dxa"/>
-            <w:bottom w:w="0" w:type="dxa"/>
-          </w:tblCellMar>
-        </w:tblPrEx>
         <w:tc>
           <w:tcPr>
             <w:tcW w:w="0" w:type="auto"/>
@@ -6318,12 +5644,6 @@
         <w:gridCol w:w="1625"/>
       </w:tblGrid>
       <w:tr>
-        <w:tblPrEx>
-          <w:tblCellMar>
-            <w:top w:w="0" w:type="dxa"/>
-            <w:bottom w:w="0" w:type="dxa"/>
-          </w:tblCellMar>
-        </w:tblPrEx>
         <w:tc>
           <w:tcPr>
             <w:tcW w:w="0" w:type="auto"/>
@@ -6407,12 +5727,6 @@
         </w:tc>
       </w:tr>
       <w:tr>
-        <w:tblPrEx>
-          <w:tblCellMar>
-            <w:top w:w="0" w:type="dxa"/>
-            <w:bottom w:w="0" w:type="dxa"/>
-          </w:tblCellMar>
-        </w:tblPrEx>
         <w:tc>
           <w:tcPr>
             <w:tcW w:w="0" w:type="auto"/>
@@ -6444,53 +5758,12 @@
             </w:tcMar>
           </w:tcPr>
           <w:p>
-            <w:proofErr w:type="spellStart"/>
-            <w:r>
-              <w:rPr>
-                <w:sz w:val="20"/>
-                <w:szCs w:val="20"/>
-              </w:rPr>
-              <w:t>Bronze</w:t>
-            </w:r>
-            <w:proofErr w:type="spellEnd"/>
-            <w:r>
-              <w:rPr>
-                <w:sz w:val="20"/>
-                <w:szCs w:val="20"/>
-              </w:rPr>
-              <w:t xml:space="preserve"> / </w:t>
-            </w:r>
-            <w:proofErr w:type="spellStart"/>
-            <w:r>
-              <w:rPr>
-                <w:sz w:val="20"/>
-                <w:szCs w:val="20"/>
-              </w:rPr>
-              <w:t>Silver</w:t>
-            </w:r>
-            <w:proofErr w:type="spellEnd"/>
-            <w:r>
-              <w:rPr>
-                <w:sz w:val="20"/>
-                <w:szCs w:val="20"/>
-              </w:rPr>
-              <w:t xml:space="preserve"> / </w:t>
-            </w:r>
-            <w:proofErr w:type="spellStart"/>
-            <w:r>
-              <w:rPr>
-                <w:sz w:val="20"/>
-                <w:szCs w:val="20"/>
-              </w:rPr>
-              <w:t>Gold</w:t>
-            </w:r>
-            <w:proofErr w:type="spellEnd"/>
-            <w:r>
-              <w:rPr>
-                <w:sz w:val="20"/>
-                <w:szCs w:val="20"/>
-              </w:rPr>
-              <w:t xml:space="preserve"> / Platinum пакети за бизнеси</w:t>
+            <w:r>
+              <w:rPr>
+                <w:sz w:val="20"/>
+                <w:szCs w:val="20"/>
+              </w:rPr>
+              <w:t>Bronze / Silver / Gold / Platinum пакети за бизнеси</w:t>
             </w:r>
           </w:p>
         </w:tc>
@@ -6516,12 +5789,6 @@
         </w:tc>
       </w:tr>
       <w:tr>
-        <w:tblPrEx>
-          <w:tblCellMar>
-            <w:top w:w="0" w:type="dxa"/>
-            <w:bottom w:w="0" w:type="dxa"/>
-          </w:tblCellMar>
-        </w:tblPrEx>
         <w:tc>
           <w:tcPr>
             <w:tcW w:w="0" w:type="auto"/>
@@ -6584,12 +5851,6 @@
         </w:tc>
       </w:tr>
       <w:tr>
-        <w:tblPrEx>
-          <w:tblCellMar>
-            <w:top w:w="0" w:type="dxa"/>
-            <w:bottom w:w="0" w:type="dxa"/>
-          </w:tblCellMar>
-        </w:tblPrEx>
         <w:tc>
           <w:tcPr>
             <w:tcW w:w="0" w:type="auto"/>
@@ -6626,23 +5887,7 @@
                 <w:sz w:val="20"/>
                 <w:szCs w:val="20"/>
               </w:rPr>
-              <w:t xml:space="preserve">Брандиране на конкретни секции (напр. „Спорт </w:t>
-            </w:r>
-            <w:proofErr w:type="spellStart"/>
-            <w:r>
-              <w:rPr>
-                <w:sz w:val="20"/>
-                <w:szCs w:val="20"/>
-              </w:rPr>
-              <w:t>by</w:t>
-            </w:r>
-            <w:proofErr w:type="spellEnd"/>
-            <w:r>
-              <w:rPr>
-                <w:sz w:val="20"/>
-                <w:szCs w:val="20"/>
-              </w:rPr>
-              <w:t>...“)</w:t>
+              <w:t>Брандиране на конкретни секции (напр. „Спорт by...“)</w:t>
             </w:r>
           </w:p>
         </w:tc>
@@ -6668,12 +5913,6 @@
         </w:tc>
       </w:tr>
       <w:tr>
-        <w:tblPrEx>
-          <w:tblCellMar>
-            <w:top w:w="0" w:type="dxa"/>
-            <w:bottom w:w="0" w:type="dxa"/>
-          </w:tblCellMar>
-        </w:tblPrEx>
         <w:tc>
           <w:tcPr>
             <w:tcW w:w="0" w:type="auto"/>
@@ -6736,12 +5975,6 @@
         </w:tc>
       </w:tr>
       <w:tr>
-        <w:tblPrEx>
-          <w:tblCellMar>
-            <w:top w:w="0" w:type="dxa"/>
-            <w:bottom w:w="0" w:type="dxa"/>
-          </w:tblCellMar>
-        </w:tblPrEx>
         <w:tc>
           <w:tcPr>
             <w:tcW w:w="0" w:type="auto"/>
@@ -6846,7 +6079,6 @@
         <w:pBdr>
           <w:left w:val="single" w:sz="12" w:space="0" w:color="E87420"/>
         </w:pBdr>
-        <w:shd w:val="clear" w:color="auto" w:fill="FFF3CD"/>
         <w:spacing w:before="150" w:after="150"/>
         <w:ind w:left="431" w:right="431"/>
       </w:pPr>
@@ -6863,23 +6095,7 @@
           <w:i/>
           <w:iCs/>
         </w:rPr>
-        <w:t xml:space="preserve">Всички финансови операции се извършват чрез легални канали. </w:t>
-      </w:r>
-      <w:proofErr w:type="spellStart"/>
-      <w:r>
-        <w:rPr>
-          <w:i/>
-          <w:iCs/>
-        </w:rPr>
-        <w:t>zNews</w:t>
-      </w:r>
-      <w:proofErr w:type="spellEnd"/>
-      <w:r>
-        <w:rPr>
-          <w:i/>
-          <w:iCs/>
-        </w:rPr>
-        <w:t xml:space="preserve"> не приема приходи от доказано нелегални дейности.</w:t>
+        <w:t>Всички финансови операции се извършват чрез легални канали. zNews не приема приходи от доказано нелегални дейности.</w:t>
       </w:r>
     </w:p>
     <w:p>
@@ -6961,12 +6177,6 @@
         <w:gridCol w:w="4135"/>
       </w:tblGrid>
       <w:tr>
-        <w:tblPrEx>
-          <w:tblCellMar>
-            <w:top w:w="0" w:type="dxa"/>
-            <w:bottom w:w="0" w:type="dxa"/>
-          </w:tblCellMar>
-        </w:tblPrEx>
         <w:tc>
           <w:tcPr>
             <w:tcW w:w="0" w:type="auto"/>
@@ -7050,12 +6260,6 @@
         </w:tc>
       </w:tr>
       <w:tr>
-        <w:tblPrEx>
-          <w:tblCellMar>
-            <w:top w:w="0" w:type="dxa"/>
-            <w:bottom w:w="0" w:type="dxa"/>
-          </w:tblCellMar>
-        </w:tblPrEx>
         <w:tc>
           <w:tcPr>
             <w:tcW w:w="0" w:type="auto"/>
@@ -7118,12 +6322,6 @@
         </w:tc>
       </w:tr>
       <w:tr>
-        <w:tblPrEx>
-          <w:tblCellMar>
-            <w:top w:w="0" w:type="dxa"/>
-            <w:bottom w:w="0" w:type="dxa"/>
-          </w:tblCellMar>
-        </w:tblPrEx>
         <w:tc>
           <w:tcPr>
             <w:tcW w:w="0" w:type="auto"/>
@@ -7186,12 +6384,6 @@
         </w:tc>
       </w:tr>
       <w:tr>
-        <w:tblPrEx>
-          <w:tblCellMar>
-            <w:top w:w="0" w:type="dxa"/>
-            <w:bottom w:w="0" w:type="dxa"/>
-          </w:tblCellMar>
-        </w:tblPrEx>
         <w:tc>
           <w:tcPr>
             <w:tcW w:w="0" w:type="auto"/>
@@ -7443,29 +6635,8 @@
       <w:pPr>
         <w:spacing w:after="120" w:line="320" w:lineRule="auto"/>
       </w:pPr>
-      <w:proofErr w:type="spellStart"/>
-      <w:r>
-        <w:t>zNews</w:t>
-      </w:r>
-      <w:proofErr w:type="spellEnd"/>
-      <w:r>
-        <w:t xml:space="preserve"> е повече от новинарски сайт — това е обществена инфраструктура за </w:t>
-      </w:r>
-      <w:proofErr w:type="spellStart"/>
-      <w:r>
-        <w:t>Los</w:t>
-      </w:r>
-      <w:proofErr w:type="spellEnd"/>
-      <w:r>
-        <w:t xml:space="preserve"> </w:t>
-      </w:r>
-      <w:proofErr w:type="spellStart"/>
-      <w:r>
-        <w:t>Santos</w:t>
-      </w:r>
-      <w:proofErr w:type="spellEnd"/>
-      <w:r>
-        <w:t>. Платформата комбинира професионална журналистика с практични обществени услуги: обяви за работа, съдебни хроники, събития и рекламна площ за градските бизнеси.</w:t>
+      <w:r>
+        <w:t>zNews е повече от новинарски сайт — това е обществена инфраструктура за Los Santos. Платформата комбинира професионална журналистика с практични обществени услуги: обяви за работа, съдебни хроники, събития и рекламна площ за градските бизнеси.</w:t>
       </w:r>
     </w:p>
     <w:p>
@@ -7473,15 +6644,7 @@
         <w:spacing w:after="120" w:line="320" w:lineRule="auto"/>
       </w:pPr>
       <w:r>
-        <w:t xml:space="preserve">Моделът е устойчив, ако се спазват три основни принципа: редакционна независимост, прозрачност на финансирането и ангажираност с общността. С разнообразните си източници на приход (рекламни пакети, спонсорства, платени обяви) и ниските оперативни разходи, </w:t>
-      </w:r>
-      <w:proofErr w:type="spellStart"/>
-      <w:r>
-        <w:t>zNews</w:t>
-      </w:r>
-      <w:proofErr w:type="spellEnd"/>
-      <w:r>
-        <w:t xml:space="preserve"> е в позиция да бъде дългосрочен и влиятелен играч в медийната екосистема на града.</w:t>
+        <w:t>Моделът е устойчив, ако се спазват три основни принципа: редакционна независимост, прозрачност на финансирането и ангажираност с общността. С разнообразните си източници на приход (рекламни пакети, спонсорства, платени обяви) и ниските оперативни разходи, zNews е в позиция да бъде дългосрочен и влиятелен играч в медийната екосистема на града.</w:t>
       </w:r>
     </w:p>
     <w:p>
@@ -7518,7 +6681,6 @@
           <w:lang w:val="en-US"/>
         </w:rPr>
       </w:pPr>
-      <w:proofErr w:type="spellStart"/>
       <w:r>
         <w:rPr>
           <w:b/>
@@ -7538,7 +6700,6 @@
         </w:rPr>
         <w:t>NEWS</w:t>
       </w:r>
-      <w:proofErr w:type="spellEnd"/>
       <w:r>
         <w:rPr>
           <w:color w:val="D4CFC5"/>
@@ -7603,7 +6764,6 @@
     <w:pPr>
       <w:jc w:val="right"/>
     </w:pPr>
-    <w:proofErr w:type="spellStart"/>
     <w:r>
       <w:rPr>
         <w:i/>
@@ -7612,18 +6772,7 @@
         <w:sz w:val="16"/>
         <w:szCs w:val="16"/>
       </w:rPr>
-      <w:t>zNews</w:t>
-    </w:r>
-    <w:proofErr w:type="spellEnd"/>
-    <w:r>
-      <w:rPr>
-        <w:i/>
-        <w:iCs/>
-        <w:color w:val="D4CFC5"/>
-        <w:sz w:val="16"/>
-        <w:szCs w:val="16"/>
-      </w:rPr>
-      <w:t xml:space="preserve">  •  Бизнес план 2026</w:t>
+      <w:t>zNews  •  Бизнес план 2026</w:t>
     </w:r>
   </w:p>
 </w:hdr>

</xml_diff>

<commit_message>
feat(admin): add image cropping and focal point selection for articles
</commit_message>
<xml_diff>
--- a/zNews_Business_Plan.docx
+++ b/zNews_Business_Plan.docx
@@ -25,8 +25,10 @@
     <w:p>
       <w:pPr>
         <w:spacing w:after="50"/>
+        <w:ind w:left="708"/>
         <w:jc w:val="center"/>
       </w:pPr>
+      <w:proofErr w:type="spellStart"/>
       <w:r>
         <w:rPr>
           <w:b/>
@@ -46,6 +48,7 @@
         </w:rPr>
         <w:t>NEWS</w:t>
       </w:r>
+      <w:proofErr w:type="spellEnd"/>
     </w:p>
     <w:p>
       <w:pPr>
@@ -54,6 +57,7 @@
           <w:bottom w:val="single" w:sz="3" w:space="0" w:color="CC0A1A"/>
         </w:pBdr>
         <w:spacing w:after="100"/>
+        <w:ind w:left="708"/>
         <w:jc w:val="center"/>
       </w:pPr>
       <w:r>
@@ -71,21 +75,25 @@
     <w:p>
       <w:pPr>
         <w:spacing w:after="120"/>
+        <w:ind w:left="708"/>
       </w:pPr>
     </w:p>
     <w:p>
       <w:pPr>
         <w:spacing w:after="120"/>
+        <w:ind w:left="708"/>
       </w:pPr>
     </w:p>
     <w:p>
       <w:pPr>
         <w:spacing w:after="120"/>
+        <w:ind w:left="708"/>
       </w:pPr>
     </w:p>
     <w:p>
       <w:pPr>
         <w:spacing w:after="200"/>
+        <w:ind w:left="708"/>
         <w:jc w:val="center"/>
       </w:pPr>
       <w:r>
@@ -101,6 +109,7 @@
     <w:p>
       <w:pPr>
         <w:spacing w:after="80"/>
+        <w:ind w:left="708"/>
         <w:jc w:val="center"/>
       </w:pPr>
       <w:r>
@@ -114,6 +123,7 @@
     <w:p>
       <w:pPr>
         <w:spacing w:after="80"/>
+        <w:ind w:left="708"/>
         <w:jc w:val="center"/>
       </w:pPr>
       <w:r>
@@ -121,27 +131,56 @@
           <w:sz w:val="26"/>
           <w:szCs w:val="26"/>
         </w:rPr>
-        <w:t>обяви и обществени услуги в Los Santos</w:t>
-      </w:r>
+        <w:t xml:space="preserve">обяви и обществени услуги в </w:t>
+      </w:r>
+      <w:proofErr w:type="spellStart"/>
+      <w:r>
+        <w:rPr>
+          <w:sz w:val="26"/>
+          <w:szCs w:val="26"/>
+        </w:rPr>
+        <w:t>Los</w:t>
+      </w:r>
+      <w:proofErr w:type="spellEnd"/>
+      <w:r>
+        <w:rPr>
+          <w:sz w:val="26"/>
+          <w:szCs w:val="26"/>
+        </w:rPr>
+        <w:t xml:space="preserve"> </w:t>
+      </w:r>
+      <w:proofErr w:type="spellStart"/>
+      <w:r>
+        <w:rPr>
+          <w:sz w:val="26"/>
+          <w:szCs w:val="26"/>
+        </w:rPr>
+        <w:t>Santos</w:t>
+      </w:r>
+      <w:proofErr w:type="spellEnd"/>
     </w:p>
     <w:p>
       <w:pPr>
         <w:spacing w:after="120"/>
+        <w:ind w:left="708"/>
       </w:pPr>
     </w:p>
     <w:p>
       <w:pPr>
         <w:spacing w:after="120"/>
+        <w:ind w:left="708"/>
       </w:pPr>
     </w:p>
     <w:p>
       <w:pPr>
         <w:spacing w:after="120"/>
+        <w:ind w:left="708"/>
       </w:pPr>
     </w:p>
     <w:p>
       <w:pPr>
         <w:spacing w:after="60"/>
+        <w:ind w:left="708"/>
         <w:jc w:val="center"/>
       </w:pPr>
       <w:r>
@@ -154,6 +193,7 @@
     <w:p>
       <w:pPr>
         <w:spacing w:after="60"/>
+        <w:ind w:left="708"/>
         <w:jc w:val="center"/>
       </w:pPr>
       <w:r>
@@ -181,6 +221,7 @@
     <w:p>
       <w:pPr>
         <w:spacing w:after="60"/>
+        <w:ind w:left="708"/>
         <w:jc w:val="center"/>
       </w:pPr>
       <w:r>
@@ -196,6 +237,7 @@
     <w:p>
       <w:pPr>
         <w:spacing w:after="60"/>
+        <w:ind w:left="708"/>
         <w:jc w:val="center"/>
       </w:pPr>
       <w:r>
@@ -205,15 +247,30 @@
     <w:p>
       <w:pPr>
         <w:spacing w:after="60"/>
+        <w:ind w:left="708"/>
         <w:jc w:val="center"/>
       </w:pPr>
       <w:r>
-        <w:t>Собственик: Diego Llamas</w:t>
-      </w:r>
+        <w:t xml:space="preserve">Собственик: </w:t>
+      </w:r>
+      <w:proofErr w:type="spellStart"/>
+      <w:r>
+        <w:t>Diego</w:t>
+      </w:r>
+      <w:proofErr w:type="spellEnd"/>
+      <w:r>
+        <w:t xml:space="preserve"> </w:t>
+      </w:r>
+      <w:proofErr w:type="spellStart"/>
+      <w:r>
+        <w:t>Llamas</w:t>
+      </w:r>
+      <w:proofErr w:type="spellEnd"/>
     </w:p>
     <w:p>
       <w:pPr>
         <w:spacing w:after="60"/>
+        <w:ind w:left="708"/>
         <w:jc w:val="center"/>
       </w:pPr>
       <w:r>
@@ -226,6 +283,7 @@
     <w:p>
       <w:pPr>
         <w:spacing w:after="60"/>
+        <w:ind w:left="708"/>
         <w:jc w:val="center"/>
       </w:pPr>
       <w:r>
@@ -235,27 +293,45 @@
     <w:p>
       <w:pPr>
         <w:spacing w:after="60"/>
+        <w:ind w:left="708"/>
         <w:jc w:val="center"/>
       </w:pPr>
+      <w:proofErr w:type="spellStart"/>
       <w:r>
         <w:rPr>
           <w:lang w:val="en-US"/>
         </w:rPr>
-        <w:t>Адрес: Lom Bank Offices 10</w:t>
+        <w:t>Адрес</w:t>
+      </w:r>
+      <w:proofErr w:type="spellEnd"/>
+      <w:r>
+        <w:rPr>
+          <w:lang w:val="en-US"/>
+        </w:rPr>
+        <w:t xml:space="preserve">: Lom Bank Offices </w:t>
+      </w:r>
+      <w:r>
+        <w:rPr>
+          <w:lang w:val="en-US"/>
+        </w:rPr>
+        <w:t>9</w:t>
       </w:r>
     </w:p>
     <w:p>
       <w:pPr>
         <w:spacing w:after="120"/>
+        <w:ind w:left="708"/>
       </w:pPr>
     </w:p>
     <w:p>
       <w:pPr>
         <w:spacing w:after="120"/>
-      </w:pPr>
-    </w:p>
-    <w:p>
-      <w:pPr>
+        <w:ind w:left="708"/>
+      </w:pPr>
+    </w:p>
+    <w:p>
+      <w:pPr>
+        <w:ind w:left="708"/>
         <w:sectPr>
           <w:pgSz w:w="11906" w:h="16838"/>
           <w:pgMar w:top="2160" w:right="1727" w:bottom="2160" w:left="1727" w:header="708" w:footer="708" w:gutter="0"/>
@@ -270,6 +346,7 @@
           <w:bottom w:val="single" w:sz="4" w:space="0" w:color="1C1428"/>
         </w:pBdr>
         <w:spacing w:after="300"/>
+        <w:ind w:left="708"/>
       </w:pPr>
       <w:r>
         <w:rPr>
@@ -285,6 +362,7 @@
     <w:p>
       <w:pPr>
         <w:spacing w:after="80"/>
+        <w:ind w:left="708"/>
       </w:pPr>
       <w:r>
         <w:rPr>
@@ -301,6 +379,7 @@
     <w:p>
       <w:pPr>
         <w:spacing w:after="80"/>
+        <w:ind w:left="708"/>
       </w:pPr>
       <w:r>
         <w:rPr>
@@ -317,6 +396,7 @@
     <w:p>
       <w:pPr>
         <w:spacing w:after="80"/>
+        <w:ind w:left="708"/>
       </w:pPr>
       <w:r>
         <w:rPr>
@@ -333,6 +413,7 @@
     <w:p>
       <w:pPr>
         <w:spacing w:after="80"/>
+        <w:ind w:left="708"/>
       </w:pPr>
       <w:r>
         <w:rPr>
@@ -349,6 +430,7 @@
     <w:p>
       <w:pPr>
         <w:spacing w:after="80"/>
+        <w:ind w:left="708"/>
       </w:pPr>
       <w:r>
         <w:rPr>
@@ -365,6 +447,7 @@
     <w:p>
       <w:pPr>
         <w:spacing w:after="80"/>
+        <w:ind w:left="708"/>
       </w:pPr>
       <w:r>
         <w:rPr>
@@ -381,6 +464,7 @@
     <w:p>
       <w:pPr>
         <w:spacing w:after="80"/>
+        <w:ind w:left="708"/>
       </w:pPr>
       <w:r>
         <w:rPr>
@@ -397,6 +481,7 @@
     <w:p>
       <w:pPr>
         <w:spacing w:after="80"/>
+        <w:ind w:left="708"/>
       </w:pPr>
       <w:r>
         <w:rPr>
@@ -413,6 +498,7 @@
     <w:p>
       <w:pPr>
         <w:spacing w:after="80"/>
+        <w:ind w:left="708"/>
       </w:pPr>
       <w:r>
         <w:rPr>
@@ -429,6 +515,7 @@
     <w:p>
       <w:pPr>
         <w:spacing w:after="80"/>
+        <w:ind w:left="708"/>
       </w:pPr>
       <w:r>
         <w:rPr>
@@ -445,6 +532,7 @@
     <w:p>
       <w:pPr>
         <w:spacing w:after="80"/>
+        <w:ind w:left="708"/>
       </w:pPr>
       <w:r>
         <w:rPr>
@@ -461,6 +549,7 @@
     <w:p>
       <w:pPr>
         <w:spacing w:after="80"/>
+        <w:ind w:left="708"/>
       </w:pPr>
       <w:r>
         <w:rPr>
@@ -477,11 +566,13 @@
     <w:p>
       <w:pPr>
         <w:spacing w:after="120"/>
+        <w:ind w:left="708"/>
       </w:pPr>
     </w:p>
     <w:p>
       <w:pPr>
         <w:spacing w:after="120"/>
+        <w:ind w:left="708"/>
       </w:pPr>
     </w:p>
     <w:p>
@@ -490,6 +581,7 @@
           <w:bottom w:val="single" w:sz="6" w:space="0" w:color="CC0A1A"/>
         </w:pBdr>
         <w:spacing w:before="400" w:after="200"/>
+        <w:ind w:left="708"/>
       </w:pPr>
       <w:r>
         <w:rPr>
@@ -514,14 +606,37 @@
     <w:p>
       <w:pPr>
         <w:spacing w:after="120" w:line="320" w:lineRule="auto"/>
-      </w:pPr>
-      <w:r>
-        <w:t>zNews е независим онлайн новинарски портал за града Los Santos, който предоставя 24/7 покритие на градските събития, криминални хроники, бизнес новини, политика, спорт и развлечения. Платформата комбинира професионална журналистика с обществени услуги: обяви за работа, съдебни хроники, календар на събития и фотогалерия.</w:t>
+        <w:ind w:left="708"/>
+      </w:pPr>
+      <w:proofErr w:type="spellStart"/>
+      <w:r>
+        <w:t>zNews</w:t>
+      </w:r>
+      <w:proofErr w:type="spellEnd"/>
+      <w:r>
+        <w:t xml:space="preserve"> е независим онлайн новинарски портал за града </w:t>
+      </w:r>
+      <w:proofErr w:type="spellStart"/>
+      <w:r>
+        <w:t>Los</w:t>
+      </w:r>
+      <w:proofErr w:type="spellEnd"/>
+      <w:r>
+        <w:t xml:space="preserve"> </w:t>
+      </w:r>
+      <w:proofErr w:type="spellStart"/>
+      <w:r>
+        <w:t>Santos</w:t>
+      </w:r>
+      <w:proofErr w:type="spellEnd"/>
+      <w:r>
+        <w:t>, който предоставя 24/7 покритие на градските събития, криминални хроники, бизнес новини, политика, спорт и развлечения. Платформата комбинира професионална журналистика с обществени услуги: обяви за работа, съдебни хроники, календар на събития и фотогалерия.</w:t>
       </w:r>
     </w:p>
     <w:p>
       <w:pPr>
         <w:spacing w:after="120" w:line="320" w:lineRule="auto"/>
+        <w:ind w:left="708"/>
       </w:pPr>
       <w:r>
         <w:t>Концепцията е създадена с визия за таблоиден стил, вдъхновен от комикс естетиката, с ясен фокус върху ангажиращо, бързо и достъпно съдържание. Платформата обслужва както читатели, които търсят актуална информация, така и бизнеси, които искат видимост в градската среда.</w:t>
@@ -530,6 +645,7 @@
     <w:p>
       <w:pPr>
         <w:spacing w:before="300" w:after="150"/>
+        <w:ind w:left="708"/>
       </w:pPr>
       <w:r>
         <w:rPr>
@@ -554,7 +670,7 @@
     <w:p>
       <w:pPr>
         <w:spacing w:after="80" w:line="300" w:lineRule="auto"/>
-        <w:ind w:left="576"/>
+        <w:ind w:left="1284"/>
       </w:pPr>
       <w:r>
         <w:rPr>
@@ -571,7 +687,7 @@
     <w:p>
       <w:pPr>
         <w:spacing w:after="80" w:line="300" w:lineRule="auto"/>
-        <w:ind w:left="576"/>
+        <w:ind w:left="1284"/>
       </w:pPr>
       <w:r>
         <w:rPr>
@@ -588,7 +704,7 @@
     <w:p>
       <w:pPr>
         <w:spacing w:after="80" w:line="300" w:lineRule="auto"/>
-        <w:ind w:left="576"/>
+        <w:ind w:left="1284"/>
       </w:pPr>
       <w:r>
         <w:rPr>
@@ -605,7 +721,7 @@
     <w:p>
       <w:pPr>
         <w:spacing w:after="80" w:line="300" w:lineRule="auto"/>
-        <w:ind w:left="576"/>
+        <w:ind w:left="1284"/>
       </w:pPr>
       <w:r>
         <w:rPr>
@@ -613,6 +729,7 @@
           <w:bCs/>
           <w:color w:val="CC0A1A"/>
         </w:rPr>
+        <w:lastRenderedPageBreak/>
         <w:t xml:space="preserve">4. </w:t>
       </w:r>
       <w:r>
@@ -622,7 +739,7 @@
     <w:p>
       <w:pPr>
         <w:spacing w:after="80" w:line="300" w:lineRule="auto"/>
-        <w:ind w:left="576"/>
+        <w:ind w:left="1284"/>
       </w:pPr>
       <w:r>
         <w:rPr>
@@ -630,7 +747,6 @@
           <w:bCs/>
           <w:color w:val="CC0A1A"/>
         </w:rPr>
-        <w:lastRenderedPageBreak/>
         <w:t xml:space="preserve">5. </w:t>
       </w:r>
       <w:r>
@@ -640,6 +756,7 @@
     <w:p>
       <w:pPr>
         <w:spacing w:before="300" w:after="150"/>
+        <w:ind w:left="708"/>
       </w:pPr>
       <w:r>
         <w:rPr>
@@ -664,6 +781,7 @@
     <w:tbl>
       <w:tblPr>
         <w:tblW w:w="5000" w:type="pct"/>
+        <w:tblInd w:w="708" w:type="dxa"/>
         <w:tblBorders>
           <w:top w:val="single" w:sz="4" w:space="0" w:color="auto"/>
           <w:left w:val="single" w:sz="4" w:space="0" w:color="auto"/>
@@ -1078,6 +1196,7 @@
     <w:p>
       <w:pPr>
         <w:spacing w:after="120"/>
+        <w:ind w:left="708"/>
       </w:pPr>
     </w:p>
     <w:p>
@@ -1086,6 +1205,7 @@
           <w:bottom w:val="single" w:sz="6" w:space="0" w:color="CC0A1A"/>
         </w:pBdr>
         <w:spacing w:before="400" w:after="200"/>
+        <w:ind w:left="708"/>
       </w:pPr>
       <w:r>
         <w:rPr>
@@ -1110,6 +1230,7 @@
     <w:p>
       <w:pPr>
         <w:spacing w:before="300" w:after="150"/>
+        <w:ind w:left="708"/>
       </w:pPr>
       <w:r>
         <w:rPr>
@@ -1128,13 +1249,24 @@
           <w:sz w:val="26"/>
           <w:szCs w:val="26"/>
         </w:rPr>
-        <w:t>Какво предлага zNews</w:t>
-      </w:r>
+        <w:t xml:space="preserve">Какво предлага </w:t>
+      </w:r>
+      <w:proofErr w:type="spellStart"/>
+      <w:r>
+        <w:rPr>
+          <w:b/>
+          <w:bCs/>
+          <w:sz w:val="26"/>
+          <w:szCs w:val="26"/>
+        </w:rPr>
+        <w:t>zNews</w:t>
+      </w:r>
+      <w:proofErr w:type="spellEnd"/>
     </w:p>
     <w:p>
       <w:pPr>
         <w:spacing w:after="80" w:line="300" w:lineRule="auto"/>
-        <w:ind w:left="576"/>
+        <w:ind w:left="1284"/>
       </w:pPr>
       <w:r>
         <w:rPr>
@@ -1145,13 +1277,29 @@
         <w:t xml:space="preserve">1. </w:t>
       </w:r>
       <w:r>
-        <w:t>Новини в реално време от всички краища на Los Santos с 24/7 редакционен цикъл.</w:t>
+        <w:t xml:space="preserve">Новини в реално време от всички краища на </w:t>
+      </w:r>
+      <w:proofErr w:type="spellStart"/>
+      <w:r>
+        <w:t>Los</w:t>
+      </w:r>
+      <w:proofErr w:type="spellEnd"/>
+      <w:r>
+        <w:t xml:space="preserve"> </w:t>
+      </w:r>
+      <w:proofErr w:type="spellStart"/>
+      <w:r>
+        <w:t>Santos</w:t>
+      </w:r>
+      <w:proofErr w:type="spellEnd"/>
+      <w:r>
+        <w:t xml:space="preserve"> с 24/7 редакционен цикъл.</w:t>
       </w:r>
     </w:p>
     <w:p>
       <w:pPr>
         <w:spacing w:after="80" w:line="300" w:lineRule="auto"/>
-        <w:ind w:left="576"/>
+        <w:ind w:left="1284"/>
       </w:pPr>
       <w:r>
         <w:rPr>
@@ -1168,7 +1316,7 @@
     <w:p>
       <w:pPr>
         <w:spacing w:after="80" w:line="300" w:lineRule="auto"/>
-        <w:ind w:left="576"/>
+        <w:ind w:left="1284"/>
       </w:pPr>
       <w:r>
         <w:rPr>
@@ -1185,7 +1333,7 @@
     <w:p>
       <w:pPr>
         <w:spacing w:after="80" w:line="300" w:lineRule="auto"/>
-        <w:ind w:left="576"/>
+        <w:ind w:left="1284"/>
       </w:pPr>
       <w:r>
         <w:rPr>
@@ -1202,7 +1350,7 @@
     <w:p>
       <w:pPr>
         <w:spacing w:after="80" w:line="300" w:lineRule="auto"/>
-        <w:ind w:left="576"/>
+        <w:ind w:left="1284"/>
       </w:pPr>
       <w:r>
         <w:rPr>
@@ -1219,7 +1367,7 @@
     <w:p>
       <w:pPr>
         <w:spacing w:after="80" w:line="300" w:lineRule="auto"/>
-        <w:ind w:left="576"/>
+        <w:ind w:left="1284"/>
       </w:pPr>
       <w:r>
         <w:rPr>
@@ -1236,7 +1384,7 @@
     <w:p>
       <w:pPr>
         <w:spacing w:after="80" w:line="300" w:lineRule="auto"/>
-        <w:ind w:left="576"/>
+        <w:ind w:left="1284"/>
       </w:pPr>
       <w:r>
         <w:rPr>
@@ -1253,7 +1401,7 @@
     <w:p>
       <w:pPr>
         <w:spacing w:after="80" w:line="300" w:lineRule="auto"/>
-        <w:ind w:left="576"/>
+        <w:ind w:left="1284"/>
       </w:pPr>
       <w:r>
         <w:rPr>
@@ -1270,6 +1418,7 @@
     <w:p>
       <w:pPr>
         <w:spacing w:before="300" w:after="150"/>
+        <w:ind w:left="708"/>
       </w:pPr>
       <w:r>
         <w:rPr>
@@ -1294,7 +1443,7 @@
     <w:p>
       <w:pPr>
         <w:spacing w:after="80" w:line="300" w:lineRule="auto"/>
-        <w:ind w:left="576"/>
+        <w:ind w:left="1284"/>
       </w:pPr>
       <w:r>
         <w:rPr>
@@ -1305,13 +1454,29 @@
         <w:t xml:space="preserve">1. </w:t>
       </w:r>
       <w:r>
-        <w:t>Жители на Los Santos, които искат да бъдат информирани за случващото се в града.</w:t>
+        <w:t xml:space="preserve">Жители на </w:t>
+      </w:r>
+      <w:proofErr w:type="spellStart"/>
+      <w:r>
+        <w:t>Los</w:t>
+      </w:r>
+      <w:proofErr w:type="spellEnd"/>
+      <w:r>
+        <w:t xml:space="preserve"> </w:t>
+      </w:r>
+      <w:proofErr w:type="spellStart"/>
+      <w:r>
+        <w:t>Santos</w:t>
+      </w:r>
+      <w:proofErr w:type="spellEnd"/>
+      <w:r>
+        <w:t>, които искат да бъдат информирани за случващото се в града.</w:t>
       </w:r>
     </w:p>
     <w:p>
       <w:pPr>
         <w:spacing w:after="80" w:line="300" w:lineRule="auto"/>
-        <w:ind w:left="576"/>
+        <w:ind w:left="1284"/>
       </w:pPr>
       <w:r>
         <w:rPr>
@@ -1329,7 +1494,7 @@
     <w:p>
       <w:pPr>
         <w:spacing w:after="80" w:line="300" w:lineRule="auto"/>
-        <w:ind w:left="576"/>
+        <w:ind w:left="1284"/>
       </w:pPr>
       <w:r>
         <w:rPr>
@@ -1346,7 +1511,7 @@
     <w:p>
       <w:pPr>
         <w:spacing w:after="80" w:line="300" w:lineRule="auto"/>
-        <w:ind w:left="576"/>
+        <w:ind w:left="1284"/>
       </w:pPr>
       <w:r>
         <w:rPr>
@@ -1363,7 +1528,7 @@
     <w:p>
       <w:pPr>
         <w:spacing w:after="80" w:line="300" w:lineRule="auto"/>
-        <w:ind w:left="576"/>
+        <w:ind w:left="1284"/>
       </w:pPr>
       <w:r>
         <w:rPr>
@@ -1380,6 +1545,7 @@
     <w:p>
       <w:pPr>
         <w:spacing w:before="300" w:after="150"/>
+        <w:ind w:left="708"/>
       </w:pPr>
       <w:r>
         <w:rPr>
@@ -1404,7 +1570,7 @@
     <w:p>
       <w:pPr>
         <w:spacing w:after="80" w:line="300" w:lineRule="auto"/>
-        <w:ind w:left="576"/>
+        <w:ind w:left="1284"/>
       </w:pPr>
       <w:r>
         <w:rPr>
@@ -1421,7 +1587,7 @@
     <w:p>
       <w:pPr>
         <w:spacing w:after="80" w:line="300" w:lineRule="auto"/>
-        <w:ind w:left="576"/>
+        <w:ind w:left="1284"/>
       </w:pPr>
       <w:r>
         <w:rPr>
@@ -1438,7 +1604,7 @@
     <w:p>
       <w:pPr>
         <w:spacing w:after="80" w:line="300" w:lineRule="auto"/>
-        <w:ind w:left="576"/>
+        <w:ind w:left="1284"/>
       </w:pPr>
       <w:r>
         <w:rPr>
@@ -1449,13 +1615,21 @@
         <w:t xml:space="preserve">3. </w:t>
       </w:r>
       <w:r>
-        <w:t>Бързина: Важните новини се публикуват веднага чрез системата за спешни съобщения (Breaking News).</w:t>
+        <w:t>Бързина: Важните новини се публикуват веднага чрез системата за спешни съобщения (</w:t>
+      </w:r>
+      <w:proofErr w:type="spellStart"/>
+      <w:r>
+        <w:t>Breaking</w:t>
+      </w:r>
+      <w:proofErr w:type="spellEnd"/>
+      <w:r>
+        <w:t xml:space="preserve"> News).</w:t>
       </w:r>
     </w:p>
     <w:p>
       <w:pPr>
         <w:spacing w:after="80" w:line="300" w:lineRule="auto"/>
-        <w:ind w:left="576"/>
+        <w:ind w:left="1284"/>
       </w:pPr>
       <w:r>
         <w:rPr>
@@ -1472,6 +1646,7 @@
     <w:p>
       <w:pPr>
         <w:spacing w:after="120"/>
+        <w:ind w:left="708"/>
       </w:pPr>
     </w:p>
     <w:p>
@@ -1480,6 +1655,7 @@
           <w:bottom w:val="single" w:sz="6" w:space="0" w:color="CC0A1A"/>
         </w:pBdr>
         <w:spacing w:before="400" w:after="200"/>
+        <w:ind w:left="708"/>
       </w:pPr>
       <w:r>
         <w:rPr>
@@ -1504,6 +1680,7 @@
     <w:p>
       <w:pPr>
         <w:spacing w:before="300" w:after="150"/>
+        <w:ind w:left="708"/>
       </w:pPr>
       <w:r>
         <w:rPr>
@@ -1528,14 +1705,37 @@
     <w:p>
       <w:pPr>
         <w:spacing w:after="120" w:line="320" w:lineRule="auto"/>
-      </w:pPr>
-      <w:r>
-        <w:t>zNews е онлайн вестник с таблоиден, комикс стил, създаден да бъде разпознаваем и ангажиращ за жителите на Los Santos. Порталът предлага следните основни секции:</w:t>
+        <w:ind w:left="708"/>
+      </w:pPr>
+      <w:proofErr w:type="spellStart"/>
+      <w:r>
+        <w:t>zNews</w:t>
+      </w:r>
+      <w:proofErr w:type="spellEnd"/>
+      <w:r>
+        <w:t xml:space="preserve"> е онлайн вестник с таблоиден, комикс стил, създаден да бъде разпознаваем и ангажиращ за жителите на </w:t>
+      </w:r>
+      <w:proofErr w:type="spellStart"/>
+      <w:r>
+        <w:t>Los</w:t>
+      </w:r>
+      <w:proofErr w:type="spellEnd"/>
+      <w:r>
+        <w:t xml:space="preserve"> </w:t>
+      </w:r>
+      <w:proofErr w:type="spellStart"/>
+      <w:r>
+        <w:t>Santos</w:t>
+      </w:r>
+      <w:proofErr w:type="spellEnd"/>
+      <w:r>
+        <w:t>. Порталът предлага следните основни секции:</w:t>
       </w:r>
     </w:p>
     <w:tbl>
       <w:tblPr>
         <w:tblW w:w="5000" w:type="pct"/>
+        <w:tblInd w:w="708" w:type="dxa"/>
         <w:tblBorders>
           <w:top w:val="single" w:sz="4" w:space="0" w:color="auto"/>
           <w:left w:val="single" w:sz="4" w:space="0" w:color="auto"/>
@@ -1916,13 +2116,31 @@
             </w:tcMar>
           </w:tcPr>
           <w:p>
-            <w:r>
-              <w:rPr>
-                <w:sz w:val="20"/>
-                <w:szCs w:val="20"/>
-              </w:rPr>
-              <w:t>Most Wanted</w:t>
-            </w:r>
+            <w:proofErr w:type="spellStart"/>
+            <w:r>
+              <w:rPr>
+                <w:sz w:val="20"/>
+                <w:szCs w:val="20"/>
+              </w:rPr>
+              <w:t>Most</w:t>
+            </w:r>
+            <w:proofErr w:type="spellEnd"/>
+            <w:r>
+              <w:rPr>
+                <w:sz w:val="20"/>
+                <w:szCs w:val="20"/>
+              </w:rPr>
+              <w:t xml:space="preserve"> </w:t>
+            </w:r>
+            <w:proofErr w:type="spellStart"/>
+            <w:r>
+              <w:rPr>
+                <w:sz w:val="20"/>
+                <w:szCs w:val="20"/>
+              </w:rPr>
+              <w:t>Wanted</w:t>
+            </w:r>
+            <w:proofErr w:type="spellEnd"/>
           </w:p>
         </w:tc>
         <w:tc>
@@ -1950,11 +2168,13 @@
     <w:p>
       <w:pPr>
         <w:spacing w:after="120"/>
+        <w:ind w:left="708"/>
       </w:pPr>
     </w:p>
     <w:p>
       <w:pPr>
         <w:spacing w:after="120"/>
+        <w:ind w:left="708"/>
       </w:pPr>
     </w:p>
     <w:p>
@@ -1963,6 +2183,7 @@
           <w:bottom w:val="single" w:sz="6" w:space="0" w:color="CC0A1A"/>
         </w:pBdr>
         <w:spacing w:before="400" w:after="200"/>
+        <w:ind w:left="708"/>
       </w:pPr>
       <w:r>
         <w:rPr>
@@ -1987,6 +2208,7 @@
     <w:p>
       <w:pPr>
         <w:spacing w:before="300" w:after="150"/>
+        <w:ind w:left="708"/>
       </w:pPr>
       <w:r>
         <w:rPr>
@@ -2011,6 +2233,7 @@
     <w:p>
       <w:pPr>
         <w:spacing w:after="120" w:line="320" w:lineRule="auto"/>
+        <w:ind w:left="708"/>
       </w:pPr>
       <w:r>
         <w:t>Платформата покрива 8 основни тематични направления:</w:t>
@@ -2019,6 +2242,7 @@
     <w:tbl>
       <w:tblPr>
         <w:tblW w:w="5000" w:type="pct"/>
+        <w:tblInd w:w="708" w:type="dxa"/>
         <w:tblBorders>
           <w:top w:val="single" w:sz="4" w:space="0" w:color="auto"/>
           <w:left w:val="single" w:sz="4" w:space="0" w:color="auto"/>
@@ -2621,11 +2845,13 @@
     <w:p>
       <w:pPr>
         <w:spacing w:after="120"/>
+        <w:ind w:left="708"/>
       </w:pPr>
     </w:p>
     <w:p>
       <w:pPr>
         <w:spacing w:before="300" w:after="150"/>
+        <w:ind w:left="708"/>
       </w:pPr>
       <w:r>
         <w:rPr>
@@ -2650,22 +2876,49 @@
     <w:p>
       <w:pPr>
         <w:spacing w:after="120" w:line="320" w:lineRule="auto"/>
-      </w:pPr>
-      <w:r>
-        <w:t>Обяви за работа (/jobs)</w:t>
+        <w:ind w:left="708"/>
+      </w:pPr>
+      <w:r>
+        <w:t>Обяви за работа (/</w:t>
+      </w:r>
+      <w:proofErr w:type="spellStart"/>
+      <w:r>
+        <w:t>jobs</w:t>
+      </w:r>
+      <w:proofErr w:type="spellEnd"/>
+      <w:r>
+        <w:t>)</w:t>
       </w:r>
     </w:p>
     <w:p>
       <w:pPr>
         <w:spacing w:after="120" w:line="320" w:lineRule="auto"/>
-      </w:pPr>
-      <w:r>
-        <w:t>Централизирана дъска за обяви за работа от легални работодатели в Los Santos. Поддържат се следните типове позиции:</w:t>
+        <w:ind w:left="708"/>
+      </w:pPr>
+      <w:r>
+        <w:t xml:space="preserve">Централизирана дъска за обяви за работа от легални работодатели в </w:t>
+      </w:r>
+      <w:proofErr w:type="spellStart"/>
+      <w:r>
+        <w:t>Los</w:t>
+      </w:r>
+      <w:proofErr w:type="spellEnd"/>
+      <w:r>
+        <w:t xml:space="preserve"> </w:t>
+      </w:r>
+      <w:proofErr w:type="spellStart"/>
+      <w:r>
+        <w:t>Santos</w:t>
+      </w:r>
+      <w:proofErr w:type="spellEnd"/>
+      <w:r>
+        <w:t>. Поддържат се следните типове позиции:</w:t>
       </w:r>
     </w:p>
     <w:tbl>
       <w:tblPr>
         <w:tblW w:w="5000" w:type="pct"/>
+        <w:tblInd w:w="708" w:type="dxa"/>
         <w:tblBorders>
           <w:top w:val="single" w:sz="4" w:space="0" w:color="auto"/>
           <w:left w:val="single" w:sz="4" w:space="0" w:color="auto"/>
@@ -3003,36 +3256,73 @@
     <w:p>
       <w:pPr>
         <w:spacing w:after="120"/>
+        <w:ind w:left="708"/>
       </w:pPr>
     </w:p>
     <w:p>
       <w:pPr>
         <w:spacing w:after="120" w:line="320" w:lineRule="auto"/>
+        <w:ind w:left="708"/>
       </w:pPr>
       <w:r>
         <w:lastRenderedPageBreak/>
-        <w:t>Съдебни хроники (/court)</w:t>
+        <w:t>Съдебни хроники (/</w:t>
+      </w:r>
+      <w:proofErr w:type="spellStart"/>
+      <w:r>
+        <w:t>court</w:t>
+      </w:r>
+      <w:proofErr w:type="spellEnd"/>
+      <w:r>
+        <w:t>)</w:t>
       </w:r>
     </w:p>
     <w:p>
       <w:pPr>
         <w:spacing w:after="120" w:line="320" w:lineRule="auto"/>
-      </w:pPr>
-      <w:r>
-        <w:t>Публичен регистър на съдебните дела в Los Santos с три статуса: насрочени, текущи и приключени. Всяко дело има ниво на тежест и обобщение на обвиненията и присъдите.</w:t>
+        <w:ind w:left="708"/>
+      </w:pPr>
+      <w:r>
+        <w:t xml:space="preserve">Публичен регистър на съдебните дела в </w:t>
+      </w:r>
+      <w:proofErr w:type="spellStart"/>
+      <w:r>
+        <w:t>Los</w:t>
+      </w:r>
+      <w:proofErr w:type="spellEnd"/>
+      <w:r>
+        <w:t xml:space="preserve"> </w:t>
+      </w:r>
+      <w:proofErr w:type="spellStart"/>
+      <w:r>
+        <w:t>Santos</w:t>
+      </w:r>
+      <w:proofErr w:type="spellEnd"/>
+      <w:r>
+        <w:t xml:space="preserve"> с три статуса: насрочени, текущи и приключени. Всяко дело има ниво на тежест и обобщение на обвиненията и присъдите.</w:t>
       </w:r>
     </w:p>
     <w:p>
       <w:pPr>
         <w:spacing w:after="120" w:line="320" w:lineRule="auto"/>
-      </w:pPr>
-      <w:r>
-        <w:t>Събития (/events)</w:t>
+        <w:ind w:left="708"/>
+      </w:pPr>
+      <w:r>
+        <w:t>Събития (/</w:t>
+      </w:r>
+      <w:proofErr w:type="spellStart"/>
+      <w:r>
+        <w:t>events</w:t>
+      </w:r>
+      <w:proofErr w:type="spellEnd"/>
+      <w:r>
+        <w:t>)</w:t>
       </w:r>
     </w:p>
     <w:p>
       <w:pPr>
         <w:spacing w:after="120" w:line="320" w:lineRule="auto"/>
+        <w:ind w:left="708"/>
       </w:pPr>
       <w:r>
         <w:t>Календар на градските събития, включващ: състезания, партита, турнири, официални срещи, концерти и обществени мероприятия.</w:t>
@@ -3041,22 +3331,41 @@
     <w:p>
       <w:pPr>
         <w:spacing w:after="120" w:line="320" w:lineRule="auto"/>
-      </w:pPr>
-      <w:r>
-        <w:t>Фотогалерия (/gallery)</w:t>
+        <w:ind w:left="708"/>
+      </w:pPr>
+      <w:r>
+        <w:t>Фотогалерия (/</w:t>
+      </w:r>
+      <w:proofErr w:type="spellStart"/>
+      <w:r>
+        <w:t>gallery</w:t>
+      </w:r>
+      <w:proofErr w:type="spellEnd"/>
+      <w:r>
+        <w:t>)</w:t>
       </w:r>
     </w:p>
     <w:p>
       <w:pPr>
         <w:spacing w:after="120" w:line="320" w:lineRule="auto"/>
-      </w:pPr>
-      <w:r>
-        <w:t>Визуална библиотека от репортажни снимки, организирани по категории, с филтриране и lightbox преглед.</w:t>
+        <w:ind w:left="708"/>
+      </w:pPr>
+      <w:r>
+        <w:t xml:space="preserve">Визуална библиотека от репортажни снимки, организирани по категории, с филтриране и </w:t>
+      </w:r>
+      <w:proofErr w:type="spellStart"/>
+      <w:r>
+        <w:t>lightbox</w:t>
+      </w:r>
+      <w:proofErr w:type="spellEnd"/>
+      <w:r>
+        <w:t xml:space="preserve"> преглед.</w:t>
       </w:r>
     </w:p>
     <w:p>
       <w:pPr>
         <w:spacing w:after="120"/>
+        <w:ind w:left="708"/>
       </w:pPr>
     </w:p>
     <w:p>
@@ -3065,6 +3374,7 @@
           <w:bottom w:val="single" w:sz="6" w:space="0" w:color="CC0A1A"/>
         </w:pBdr>
         <w:spacing w:before="400" w:after="200"/>
+        <w:ind w:left="708"/>
       </w:pPr>
       <w:r>
         <w:rPr>
@@ -3089,6 +3399,7 @@
     <w:p>
       <w:pPr>
         <w:spacing w:before="300" w:after="150"/>
+        <w:ind w:left="708"/>
       </w:pPr>
       <w:r>
         <w:rPr>
@@ -3113,7 +3424,7 @@
     <w:p>
       <w:pPr>
         <w:spacing w:after="80" w:line="300" w:lineRule="auto"/>
-        <w:ind w:left="576"/>
+        <w:ind w:left="1284"/>
       </w:pPr>
       <w:r>
         <w:rPr>
@@ -3130,7 +3441,7 @@
     <w:p>
       <w:pPr>
         <w:spacing w:after="80" w:line="300" w:lineRule="auto"/>
-        <w:ind w:left="576"/>
+        <w:ind w:left="1284"/>
       </w:pPr>
       <w:r>
         <w:rPr>
@@ -3141,13 +3452,29 @@
         <w:t xml:space="preserve">2. </w:t>
       </w:r>
       <w:r>
-        <w:t>Страничен банер в sidebar секцията (винаги видим при скролиране).</w:t>
+        <w:t xml:space="preserve">Страничен банер в </w:t>
+      </w:r>
+      <w:proofErr w:type="spellStart"/>
+      <w:r>
+        <w:t>sidebar</w:t>
+      </w:r>
+      <w:proofErr w:type="spellEnd"/>
+      <w:r>
+        <w:t xml:space="preserve"> секцията (винаги видим при </w:t>
+      </w:r>
+      <w:proofErr w:type="spellStart"/>
+      <w:r>
+        <w:t>скролиране</w:t>
+      </w:r>
+      <w:proofErr w:type="spellEnd"/>
+      <w:r>
+        <w:t>).</w:t>
       </w:r>
     </w:p>
     <w:p>
       <w:pPr>
         <w:spacing w:after="80" w:line="300" w:lineRule="auto"/>
-        <w:ind w:left="576"/>
+        <w:ind w:left="1284"/>
       </w:pPr>
       <w:r>
         <w:rPr>
@@ -3164,7 +3491,7 @@
     <w:p>
       <w:pPr>
         <w:spacing w:after="80" w:line="300" w:lineRule="auto"/>
-        <w:ind w:left="576"/>
+        <w:ind w:left="1284"/>
       </w:pPr>
       <w:r>
         <w:rPr>
@@ -3181,6 +3508,7 @@
     <w:p>
       <w:pPr>
         <w:spacing w:before="300" w:after="150"/>
+        <w:ind w:left="708"/>
       </w:pPr>
       <w:r>
         <w:rPr>
@@ -3205,6 +3533,7 @@
     <w:tbl>
       <w:tblPr>
         <w:tblW w:w="5000" w:type="pct"/>
+        <w:tblInd w:w="708" w:type="dxa"/>
         <w:tblBorders>
           <w:top w:val="single" w:sz="4" w:space="0" w:color="auto"/>
           <w:left w:val="single" w:sz="4" w:space="0" w:color="auto"/>
@@ -3347,6 +3676,7 @@
             </w:tcMar>
           </w:tcPr>
           <w:p>
+            <w:proofErr w:type="spellStart"/>
             <w:r>
               <w:rPr>
                 <w:sz w:val="20"/>
@@ -3354,6 +3684,7 @@
               </w:rPr>
               <w:t>Bronze</w:t>
             </w:r>
+            <w:proofErr w:type="spellEnd"/>
           </w:p>
         </w:tc>
         <w:tc>
@@ -3429,6 +3760,7 @@
             </w:tcMar>
           </w:tcPr>
           <w:p>
+            <w:proofErr w:type="spellStart"/>
             <w:r>
               <w:rPr>
                 <w:sz w:val="20"/>
@@ -3436,6 +3768,7 @@
               </w:rPr>
               <w:t>Silver</w:t>
             </w:r>
+            <w:proofErr w:type="spellEnd"/>
           </w:p>
         </w:tc>
         <w:tc>
@@ -3511,6 +3844,7 @@
             </w:tcMar>
           </w:tcPr>
           <w:p>
+            <w:proofErr w:type="spellStart"/>
             <w:r>
               <w:rPr>
                 <w:sz w:val="20"/>
@@ -3518,6 +3852,7 @@
               </w:rPr>
               <w:t>Gold</w:t>
             </w:r>
+            <w:proofErr w:type="spellEnd"/>
           </w:p>
         </w:tc>
         <w:tc>
@@ -3618,7 +3953,23 @@
                 <w:sz w:val="20"/>
                 <w:szCs w:val="20"/>
               </w:rPr>
-              <w:t>Всичко от Gold + спонсорирана статия + брандиране на секция</w:t>
+              <w:t xml:space="preserve">Всичко от </w:t>
+            </w:r>
+            <w:proofErr w:type="spellStart"/>
+            <w:r>
+              <w:rPr>
+                <w:sz w:val="20"/>
+                <w:szCs w:val="20"/>
+              </w:rPr>
+              <w:t>Gold</w:t>
+            </w:r>
+            <w:proofErr w:type="spellEnd"/>
+            <w:r>
+              <w:rPr>
+                <w:sz w:val="20"/>
+                <w:szCs w:val="20"/>
+              </w:rPr>
+              <w:t xml:space="preserve"> + спонсорирана статия + брандиране на секция</w:t>
             </w:r>
           </w:p>
         </w:tc>
@@ -3667,6 +4018,7 @@
     <w:p>
       <w:pPr>
         <w:spacing w:before="120" w:after="120"/>
+        <w:ind w:left="708"/>
       </w:pPr>
       <w:r>
         <w:rPr>
@@ -3681,21 +4033,25 @@
     <w:p>
       <w:pPr>
         <w:spacing w:after="120"/>
+        <w:ind w:left="708"/>
       </w:pPr>
     </w:p>
     <w:p>
       <w:pPr>
         <w:spacing w:after="120"/>
+        <w:ind w:left="708"/>
       </w:pPr>
     </w:p>
     <w:p>
       <w:pPr>
         <w:spacing w:after="120"/>
+        <w:ind w:left="708"/>
       </w:pPr>
     </w:p>
     <w:p>
       <w:pPr>
         <w:spacing w:before="300" w:after="150"/>
+        <w:ind w:left="708"/>
       </w:pPr>
       <w:r>
         <w:rPr>
@@ -3705,7 +4061,6 @@
           <w:sz w:val="26"/>
           <w:szCs w:val="26"/>
         </w:rPr>
-        <w:lastRenderedPageBreak/>
         <w:t xml:space="preserve">5.3 </w:t>
       </w:r>
       <w:r>
@@ -3726,10 +4081,26 @@
           <w:numId w:val="1"/>
         </w:numPr>
         <w:spacing w:after="80" w:line="300" w:lineRule="auto"/>
-        <w:ind w:left="576"/>
-      </w:pPr>
-      <w:r>
-        <w:t>Висока видимост сред активната общност на Los Santos.</w:t>
+        <w:ind w:left="1284"/>
+      </w:pPr>
+      <w:r>
+        <w:t xml:space="preserve">Висока видимост сред активната общност на </w:t>
+      </w:r>
+      <w:proofErr w:type="spellStart"/>
+      <w:r>
+        <w:t>Los</w:t>
+      </w:r>
+      <w:proofErr w:type="spellEnd"/>
+      <w:r>
+        <w:t xml:space="preserve"> </w:t>
+      </w:r>
+      <w:proofErr w:type="spellStart"/>
+      <w:r>
+        <w:t>Santos</w:t>
+      </w:r>
+      <w:proofErr w:type="spellEnd"/>
+      <w:r>
+        <w:t>.</w:t>
       </w:r>
     </w:p>
     <w:p>
@@ -3740,7 +4111,7 @@
           <w:numId w:val="1"/>
         </w:numPr>
         <w:spacing w:after="80" w:line="300" w:lineRule="auto"/>
-        <w:ind w:left="576"/>
+        <w:ind w:left="1284"/>
       </w:pPr>
       <w:r>
         <w:t>Таргетирана аудитория от жители, които активно следят градските новини.</w:t>
@@ -3754,7 +4125,7 @@
           <w:numId w:val="1"/>
         </w:numPr>
         <w:spacing w:after="80" w:line="300" w:lineRule="auto"/>
-        <w:ind w:left="576"/>
+        <w:ind w:left="1284"/>
       </w:pPr>
       <w:r>
         <w:t>Детайлна статистика за показвания и интерес от читателите.</w:t>
@@ -3768,7 +4139,7 @@
           <w:numId w:val="1"/>
         </w:numPr>
         <w:spacing w:after="80" w:line="300" w:lineRule="auto"/>
-        <w:ind w:left="576"/>
+        <w:ind w:left="1284"/>
       </w:pPr>
       <w:r>
         <w:t>Възможност за спонсориране на конкретни секции или събития.</w:t>
@@ -3777,6 +4148,7 @@
     <w:p>
       <w:pPr>
         <w:spacing w:after="120"/>
+        <w:ind w:left="708"/>
       </w:pPr>
     </w:p>
     <w:p>
@@ -3785,6 +4157,7 @@
           <w:bottom w:val="single" w:sz="6" w:space="0" w:color="CC0A1A"/>
         </w:pBdr>
         <w:spacing w:before="400" w:after="200"/>
+        <w:ind w:left="708"/>
       </w:pPr>
       <w:r>
         <w:rPr>
@@ -3809,14 +4182,24 @@
     <w:p>
       <w:pPr>
         <w:spacing w:after="120" w:line="320" w:lineRule="auto"/>
-      </w:pPr>
-      <w:r>
-        <w:t>Освен новинарско покритие, zNews изпълнява и функцията на обществен информационен хъб за града:</w:t>
+        <w:ind w:left="708"/>
+      </w:pPr>
+      <w:r>
+        <w:t xml:space="preserve">Освен новинарско покритие, </w:t>
+      </w:r>
+      <w:proofErr w:type="spellStart"/>
+      <w:r>
+        <w:t>zNews</w:t>
+      </w:r>
+      <w:proofErr w:type="spellEnd"/>
+      <w:r>
+        <w:t xml:space="preserve"> изпълнява и функцията на обществен информационен хъб за града:</w:t>
       </w:r>
     </w:p>
     <w:tbl>
       <w:tblPr>
         <w:tblW w:w="5000" w:type="pct"/>
+        <w:tblInd w:w="708" w:type="dxa"/>
         <w:tblBorders>
           <w:top w:val="single" w:sz="4" w:space="0" w:color="auto"/>
           <w:left w:val="single" w:sz="4" w:space="0" w:color="auto"/>
@@ -4055,13 +4438,31 @@
             </w:tcMar>
           </w:tcPr>
           <w:p>
-            <w:r>
-              <w:rPr>
-                <w:sz w:val="20"/>
-                <w:szCs w:val="20"/>
-              </w:rPr>
-              <w:t>Most Wanted</w:t>
-            </w:r>
+            <w:proofErr w:type="spellStart"/>
+            <w:r>
+              <w:rPr>
+                <w:sz w:val="20"/>
+                <w:szCs w:val="20"/>
+              </w:rPr>
+              <w:t>Most</w:t>
+            </w:r>
+            <w:proofErr w:type="spellEnd"/>
+            <w:r>
+              <w:rPr>
+                <w:sz w:val="20"/>
+                <w:szCs w:val="20"/>
+              </w:rPr>
+              <w:t xml:space="preserve"> </w:t>
+            </w:r>
+            <w:proofErr w:type="spellStart"/>
+            <w:r>
+              <w:rPr>
+                <w:sz w:val="20"/>
+                <w:szCs w:val="20"/>
+              </w:rPr>
+              <w:t>Wanted</w:t>
+            </w:r>
+            <w:proofErr w:type="spellEnd"/>
           </w:p>
         </w:tc>
         <w:tc>
@@ -4233,6 +4634,7 @@
     <w:p>
       <w:pPr>
         <w:spacing w:after="120"/>
+        <w:ind w:left="708"/>
       </w:pPr>
     </w:p>
     <w:p>
@@ -4241,7 +4643,7 @@
           <w:left w:val="single" w:sz="12" w:space="0" w:color="E87420"/>
         </w:pBdr>
         <w:spacing w:before="150" w:after="150"/>
-        <w:ind w:left="431" w:right="431"/>
+        <w:ind w:left="1139" w:right="431"/>
       </w:pPr>
       <w:r>
         <w:rPr>
@@ -4251,17 +4653,27 @@
         </w:rPr>
         <w:t xml:space="preserve">⚠ </w:t>
       </w:r>
+      <w:proofErr w:type="spellStart"/>
       <w:r>
         <w:rPr>
           <w:i/>
           <w:iCs/>
         </w:rPr>
-        <w:t>zNews не се ангажира с интересите на конкретни фракции. Обществените услуги са достъпни за всички легални организации и граждани.</w:t>
+        <w:t>zNews</w:t>
+      </w:r>
+      <w:proofErr w:type="spellEnd"/>
+      <w:r>
+        <w:rPr>
+          <w:i/>
+          <w:iCs/>
+        </w:rPr>
+        <w:t xml:space="preserve"> не се ангажира с интересите на конкретни фракции. Обществените услуги са достъпни за всички легални организации и граждани.</w:t>
       </w:r>
     </w:p>
     <w:p>
       <w:pPr>
         <w:spacing w:after="120"/>
+        <w:ind w:left="708"/>
       </w:pPr>
     </w:p>
     <w:p>
@@ -4270,6 +4682,7 @@
           <w:bottom w:val="single" w:sz="6" w:space="0" w:color="CC0A1A"/>
         </w:pBdr>
         <w:spacing w:before="400" w:after="200"/>
+        <w:ind w:left="708"/>
       </w:pPr>
       <w:r>
         <w:rPr>
@@ -4294,6 +4707,7 @@
     <w:p>
       <w:pPr>
         <w:spacing w:before="300" w:after="150"/>
+        <w:ind w:left="708"/>
       </w:pPr>
       <w:r>
         <w:rPr>
@@ -4318,6 +4732,7 @@
     <w:tbl>
       <w:tblPr>
         <w:tblW w:w="5000" w:type="pct"/>
+        <w:tblInd w:w="708" w:type="dxa"/>
         <w:tblBorders>
           <w:top w:val="single" w:sz="4" w:space="0" w:color="auto"/>
           <w:left w:val="single" w:sz="4" w:space="0" w:color="auto"/>
@@ -4409,6 +4824,7 @@
                 <w:sz w:val="20"/>
                 <w:szCs w:val="20"/>
               </w:rPr>
+              <w:lastRenderedPageBreak/>
               <w:t>Главен редактор</w:t>
             </w:r>
           </w:p>
@@ -4535,7 +4951,6 @@
                 <w:sz w:val="20"/>
                 <w:szCs w:val="20"/>
               </w:rPr>
-              <w:lastRenderedPageBreak/>
               <w:t>Рекламен координатор</w:t>
             </w:r>
           </w:p>
@@ -4649,11 +5064,13 @@
     <w:p>
       <w:pPr>
         <w:spacing w:after="120"/>
+        <w:ind w:left="708"/>
       </w:pPr>
     </w:p>
     <w:p>
       <w:pPr>
         <w:spacing w:before="300" w:after="150"/>
+        <w:ind w:left="708"/>
       </w:pPr>
       <w:r>
         <w:rPr>
@@ -4678,7 +5095,7 @@
     <w:p>
       <w:pPr>
         <w:spacing w:after="80" w:line="300" w:lineRule="auto"/>
-        <w:ind w:left="576"/>
+        <w:ind w:left="1284"/>
       </w:pPr>
       <w:r>
         <w:rPr>
@@ -4695,7 +5112,7 @@
     <w:p>
       <w:pPr>
         <w:spacing w:after="80" w:line="300" w:lineRule="auto"/>
-        <w:ind w:left="576"/>
+        <w:ind w:left="1284"/>
       </w:pPr>
       <w:r>
         <w:rPr>
@@ -4712,7 +5129,7 @@
     <w:p>
       <w:pPr>
         <w:spacing w:after="80" w:line="300" w:lineRule="auto"/>
-        <w:ind w:left="576"/>
+        <w:ind w:left="1284"/>
       </w:pPr>
       <w:r>
         <w:rPr>
@@ -4729,7 +5146,7 @@
     <w:p>
       <w:pPr>
         <w:spacing w:after="80" w:line="300" w:lineRule="auto"/>
-        <w:ind w:left="576"/>
+        <w:ind w:left="1284"/>
       </w:pPr>
       <w:r>
         <w:rPr>
@@ -4746,7 +5163,7 @@
     <w:p>
       <w:pPr>
         <w:spacing w:after="80" w:line="300" w:lineRule="auto"/>
-        <w:ind w:left="576"/>
+        <w:ind w:left="1284"/>
       </w:pPr>
       <w:r>
         <w:rPr>
@@ -4757,12 +5174,21 @@
         <w:t xml:space="preserve">5. </w:t>
       </w:r>
       <w:r>
-        <w:t>При спешни новини се използва системата за Breaking News за незабавно излъчване.</w:t>
+        <w:t xml:space="preserve">При спешни новини се използва системата за </w:t>
+      </w:r>
+      <w:proofErr w:type="spellStart"/>
+      <w:r>
+        <w:t>Breaking</w:t>
+      </w:r>
+      <w:proofErr w:type="spellEnd"/>
+      <w:r>
+        <w:t xml:space="preserve"> News за незабавно излъчване.</w:t>
       </w:r>
     </w:p>
     <w:p>
       <w:pPr>
         <w:spacing w:before="300" w:after="150"/>
+        <w:ind w:left="708"/>
       </w:pPr>
       <w:r>
         <w:rPr>
@@ -4787,6 +5213,7 @@
     <w:p>
       <w:pPr>
         <w:spacing w:after="120" w:line="320" w:lineRule="auto"/>
+        <w:ind w:left="708"/>
       </w:pPr>
       <w:r>
         <w:t>Поддържа се вътрешен журнал на редакцията, в който се записват: дата и час, извършено действие, отговорен служител и резултат. Целта е проследимост, прозрачност и предотвратяване на грешки.</w:t>
@@ -4795,6 +5222,7 @@
     <w:p>
       <w:pPr>
         <w:spacing w:after="120"/>
+        <w:ind w:left="708"/>
       </w:pPr>
     </w:p>
     <w:p>
@@ -4803,6 +5231,7 @@
           <w:bottom w:val="single" w:sz="6" w:space="0" w:color="CC0A1A"/>
         </w:pBdr>
         <w:spacing w:before="400" w:after="200"/>
+        <w:ind w:left="708"/>
       </w:pPr>
       <w:r>
         <w:rPr>
@@ -4827,6 +5256,7 @@
     <w:p>
       <w:pPr>
         <w:spacing w:before="300" w:after="150"/>
+        <w:ind w:left="708"/>
       </w:pPr>
       <w:r>
         <w:rPr>
@@ -4851,7 +5281,7 @@
     <w:p>
       <w:pPr>
         <w:spacing w:after="80" w:line="300" w:lineRule="auto"/>
-        <w:ind w:left="576"/>
+        <w:ind w:left="1284"/>
       </w:pPr>
       <w:r>
         <w:rPr>
@@ -4868,7 +5298,7 @@
     <w:p>
       <w:pPr>
         <w:spacing w:after="80" w:line="300" w:lineRule="auto"/>
-        <w:ind w:left="576"/>
+        <w:ind w:left="1284"/>
       </w:pPr>
       <w:r>
         <w:rPr>
@@ -4885,7 +5315,7 @@
     <w:p>
       <w:pPr>
         <w:spacing w:after="80" w:line="300" w:lineRule="auto"/>
-        <w:ind w:left="576"/>
+        <w:ind w:left="1284"/>
       </w:pPr>
       <w:r>
         <w:rPr>
@@ -4893,6 +5323,7 @@
           <w:bCs/>
           <w:color w:val="CC0A1A"/>
         </w:rPr>
+        <w:lastRenderedPageBreak/>
         <w:t xml:space="preserve">3. </w:t>
       </w:r>
       <w:r>
@@ -4902,7 +5333,7 @@
     <w:p>
       <w:pPr>
         <w:spacing w:after="80" w:line="300" w:lineRule="auto"/>
-        <w:ind w:left="576"/>
+        <w:ind w:left="1284"/>
       </w:pPr>
       <w:r>
         <w:rPr>
@@ -4919,7 +5350,7 @@
     <w:p>
       <w:pPr>
         <w:spacing w:after="80" w:line="300" w:lineRule="auto"/>
-        <w:ind w:left="576"/>
+        <w:ind w:left="1284"/>
       </w:pPr>
       <w:r>
         <w:rPr>
@@ -4936,6 +5367,7 @@
     <w:p>
       <w:pPr>
         <w:spacing w:before="300" w:after="150"/>
+        <w:ind w:left="708"/>
       </w:pPr>
       <w:r>
         <w:rPr>
@@ -4960,7 +5392,7 @@
     <w:p>
       <w:pPr>
         <w:spacing w:after="80" w:line="300" w:lineRule="auto"/>
-        <w:ind w:left="576"/>
+        <w:ind w:left="1284"/>
       </w:pPr>
       <w:r>
         <w:rPr>
@@ -4977,7 +5409,7 @@
     <w:p>
       <w:pPr>
         <w:spacing w:after="80" w:line="300" w:lineRule="auto"/>
-        <w:ind w:left="576"/>
+        <w:ind w:left="1284"/>
       </w:pPr>
       <w:r>
         <w:rPr>
@@ -4985,7 +5417,6 @@
           <w:bCs/>
           <w:color w:val="CC0A1A"/>
         </w:rPr>
-        <w:lastRenderedPageBreak/>
         <w:t xml:space="preserve">2. </w:t>
       </w:r>
       <w:r>
@@ -4995,7 +5426,7 @@
     <w:p>
       <w:pPr>
         <w:spacing w:after="80" w:line="300" w:lineRule="auto"/>
-        <w:ind w:left="576"/>
+        <w:ind w:left="1284"/>
       </w:pPr>
       <w:r>
         <w:rPr>
@@ -5012,7 +5443,7 @@
     <w:p>
       <w:pPr>
         <w:spacing w:after="80" w:line="300" w:lineRule="auto"/>
-        <w:ind w:left="576"/>
+        <w:ind w:left="1284"/>
       </w:pPr>
       <w:r>
         <w:rPr>
@@ -5029,6 +5460,7 @@
     <w:p>
       <w:pPr>
         <w:spacing w:before="300" w:after="150"/>
+        <w:ind w:left="708"/>
       </w:pPr>
       <w:r>
         <w:rPr>
@@ -5053,14 +5485,24 @@
     <w:p>
       <w:pPr>
         <w:spacing w:after="120" w:line="320" w:lineRule="auto"/>
-      </w:pPr>
-      <w:r>
-        <w:t>Журналистите на zNews нямат право да отразяват теми, в които имат пряк личен или бизнес интерес. Рекламодателите нямат влияние върху редакционното съдържание. Всяко нарушение се санкционира от главния редактор.</w:t>
+        <w:ind w:left="708"/>
+      </w:pPr>
+      <w:r>
+        <w:t xml:space="preserve">Журналистите на </w:t>
+      </w:r>
+      <w:proofErr w:type="spellStart"/>
+      <w:r>
+        <w:t>zNews</w:t>
+      </w:r>
+      <w:proofErr w:type="spellEnd"/>
+      <w:r>
+        <w:t xml:space="preserve"> нямат право да отразяват теми, в които имат пряк личен или бизнес интерес. Рекламодателите нямат влияние върху редакционното съдържание. Всяко нарушение се санкционира от главния редактор.</w:t>
       </w:r>
     </w:p>
     <w:p>
       <w:pPr>
         <w:spacing w:after="120"/>
+        <w:ind w:left="708"/>
       </w:pPr>
     </w:p>
     <w:p>
@@ -5069,6 +5511,7 @@
           <w:bottom w:val="single" w:sz="6" w:space="0" w:color="CC0A1A"/>
         </w:pBdr>
         <w:spacing w:before="400" w:after="200"/>
+        <w:ind w:left="708"/>
       </w:pPr>
       <w:r>
         <w:rPr>
@@ -5093,6 +5536,7 @@
     <w:p>
       <w:pPr>
         <w:spacing w:before="300" w:after="150"/>
+        <w:ind w:left="708"/>
       </w:pPr>
       <w:r>
         <w:rPr>
@@ -5111,20 +5555,54 @@
           <w:sz w:val="26"/>
           <w:szCs w:val="26"/>
         </w:rPr>
-        <w:t>Как работи zNews</w:t>
-      </w:r>
+        <w:t xml:space="preserve">Как работи </w:t>
+      </w:r>
+      <w:proofErr w:type="spellStart"/>
+      <w:r>
+        <w:rPr>
+          <w:b/>
+          <w:bCs/>
+          <w:sz w:val="26"/>
+          <w:szCs w:val="26"/>
+        </w:rPr>
+        <w:t>zNews</w:t>
+      </w:r>
+      <w:proofErr w:type="spellEnd"/>
     </w:p>
     <w:p>
       <w:pPr>
         <w:spacing w:after="120" w:line="320" w:lineRule="auto"/>
-      </w:pPr>
-      <w:r>
-        <w:t>zNews функционира като онлайн вестник, достъпен 24 часа в денонощието за всички жители на Los Santos. Платформата е проектирана да бъде бърза, лесна за навигация и достъпна от всяко устройство.</w:t>
+        <w:ind w:left="708"/>
+      </w:pPr>
+      <w:proofErr w:type="spellStart"/>
+      <w:r>
+        <w:t>zNews</w:t>
+      </w:r>
+      <w:proofErr w:type="spellEnd"/>
+      <w:r>
+        <w:t xml:space="preserve"> функционира като онлайн вестник, достъпен 24 часа в денонощието за всички жители на </w:t>
+      </w:r>
+      <w:proofErr w:type="spellStart"/>
+      <w:r>
+        <w:t>Los</w:t>
+      </w:r>
+      <w:proofErr w:type="spellEnd"/>
+      <w:r>
+        <w:t xml:space="preserve"> </w:t>
+      </w:r>
+      <w:proofErr w:type="spellStart"/>
+      <w:r>
+        <w:t>Santos</w:t>
+      </w:r>
+      <w:proofErr w:type="spellEnd"/>
+      <w:r>
+        <w:t>. Платформата е проектирана да бъде бърза, лесна за навигация и достъпна от всяко устройство.</w:t>
       </w:r>
     </w:p>
     <w:tbl>
       <w:tblPr>
         <w:tblW w:w="5000" w:type="pct"/>
+        <w:tblInd w:w="708" w:type="dxa"/>
         <w:tblBorders>
           <w:top w:val="single" w:sz="4" w:space="0" w:color="auto"/>
           <w:left w:val="single" w:sz="4" w:space="0" w:color="auto"/>
@@ -5236,8 +5714,33 @@
                 <w:sz w:val="20"/>
                 <w:szCs w:val="20"/>
               </w:rPr>
-              <w:t>Централен портал за новини, достъпен за всеки гражданин на Los Santos</w:t>
-            </w:r>
+              <w:t xml:space="preserve">Централен портал за новини, достъпен за всеки гражданин на </w:t>
+            </w:r>
+            <w:proofErr w:type="spellStart"/>
+            <w:r>
+              <w:rPr>
+                <w:sz w:val="20"/>
+                <w:szCs w:val="20"/>
+              </w:rPr>
+              <w:t>Los</w:t>
+            </w:r>
+            <w:proofErr w:type="spellEnd"/>
+            <w:r>
+              <w:rPr>
+                <w:sz w:val="20"/>
+                <w:szCs w:val="20"/>
+              </w:rPr>
+              <w:t xml:space="preserve"> </w:t>
+            </w:r>
+            <w:proofErr w:type="spellStart"/>
+            <w:r>
+              <w:rPr>
+                <w:sz w:val="20"/>
+                <w:szCs w:val="20"/>
+              </w:rPr>
+              <w:t>Santos</w:t>
+            </w:r>
+            <w:proofErr w:type="spellEnd"/>
           </w:p>
         </w:tc>
       </w:tr>
@@ -5278,7 +5781,23 @@
                 <w:sz w:val="20"/>
                 <w:szCs w:val="20"/>
               </w:rPr>
-              <w:t>Система за моментално разпространение на важни съобщения (Breaking News)</w:t>
+              <w:t>Система за моментално разпространение на важни съобщения (</w:t>
+            </w:r>
+            <w:proofErr w:type="spellStart"/>
+            <w:r>
+              <w:rPr>
+                <w:sz w:val="20"/>
+                <w:szCs w:val="20"/>
+              </w:rPr>
+              <w:t>Breaking</w:t>
+            </w:r>
+            <w:proofErr w:type="spellEnd"/>
+            <w:r>
+              <w:rPr>
+                <w:sz w:val="20"/>
+                <w:szCs w:val="20"/>
+              </w:rPr>
+              <w:t xml:space="preserve"> News)</w:t>
             </w:r>
           </w:p>
         </w:tc>
@@ -5455,11 +5974,13 @@
     <w:p>
       <w:pPr>
         <w:spacing w:after="120"/>
+        <w:ind w:left="708"/>
       </w:pPr>
     </w:p>
     <w:p>
       <w:pPr>
         <w:spacing w:before="300" w:after="150"/>
+        <w:ind w:left="708"/>
       </w:pPr>
       <w:r>
         <w:rPr>
@@ -5469,6 +5990,7 @@
           <w:sz w:val="26"/>
           <w:szCs w:val="26"/>
         </w:rPr>
+        <w:lastRenderedPageBreak/>
         <w:t xml:space="preserve">9.2 </w:t>
       </w:r>
       <w:r>
@@ -5489,7 +6011,7 @@
           <w:numId w:val="1"/>
         </w:numPr>
         <w:spacing w:after="80" w:line="300" w:lineRule="auto"/>
-        <w:ind w:left="576"/>
+        <w:ind w:left="1284"/>
       </w:pPr>
       <w:r>
         <w:t>Публикуване на новини в реално време при спешни ситуации.</w:t>
@@ -5503,7 +6025,7 @@
           <w:numId w:val="1"/>
         </w:numPr>
         <w:spacing w:after="80" w:line="300" w:lineRule="auto"/>
-        <w:ind w:left="576"/>
+        <w:ind w:left="1284"/>
       </w:pPr>
       <w:r>
         <w:t>Редакционна верига с преглед и одобрение на всеки материал.</w:t>
@@ -5517,7 +6039,7 @@
           <w:numId w:val="1"/>
         </w:numPr>
         <w:spacing w:after="80" w:line="300" w:lineRule="auto"/>
-        <w:ind w:left="576"/>
+        <w:ind w:left="1284"/>
       </w:pPr>
       <w:r>
         <w:t>Разделение на роли в екипа с ясни отговорности и права.</w:t>
@@ -5531,7 +6053,7 @@
           <w:numId w:val="1"/>
         </w:numPr>
         <w:spacing w:after="80" w:line="300" w:lineRule="auto"/>
-        <w:ind w:left="576"/>
+        <w:ind w:left="1284"/>
       </w:pPr>
       <w:r>
         <w:t>Журнал на всички редакционни действия за прозрачност и отчетност.</w:t>
@@ -5545,7 +6067,7 @@
           <w:numId w:val="1"/>
         </w:numPr>
         <w:spacing w:after="80" w:line="300" w:lineRule="auto"/>
-        <w:ind w:left="576"/>
+        <w:ind w:left="1284"/>
       </w:pPr>
       <w:r>
         <w:t>Архив на всички публикации, достъпен за читателите.</w:t>
@@ -5559,7 +6081,7 @@
           <w:numId w:val="1"/>
         </w:numPr>
         <w:spacing w:after="80" w:line="300" w:lineRule="auto"/>
-        <w:ind w:left="576"/>
+        <w:ind w:left="1284"/>
       </w:pPr>
       <w:r>
         <w:t>Модерация на коментари за поддържане на културен тон в дискусиите.</w:t>
@@ -5568,6 +6090,7 @@
     <w:p>
       <w:pPr>
         <w:spacing w:after="120"/>
+        <w:ind w:left="708"/>
       </w:pPr>
     </w:p>
     <w:p>
@@ -5576,6 +6099,7 @@
           <w:bottom w:val="single" w:sz="6" w:space="0" w:color="CC0A1A"/>
         </w:pBdr>
         <w:spacing w:before="400" w:after="200"/>
+        <w:ind w:left="708"/>
       </w:pPr>
       <w:r>
         <w:rPr>
@@ -5600,6 +6124,7 @@
     <w:p>
       <w:pPr>
         <w:spacing w:before="300" w:after="150"/>
+        <w:ind w:left="708"/>
       </w:pPr>
       <w:r>
         <w:rPr>
@@ -5624,6 +6149,7 @@
     <w:tbl>
       <w:tblPr>
         <w:tblW w:w="5000" w:type="pct"/>
+        <w:tblInd w:w="708" w:type="dxa"/>
         <w:tblBorders>
           <w:top w:val="single" w:sz="4" w:space="0" w:color="auto"/>
           <w:left w:val="single" w:sz="4" w:space="0" w:color="auto"/>
@@ -5758,12 +6284,53 @@
             </w:tcMar>
           </w:tcPr>
           <w:p>
-            <w:r>
-              <w:rPr>
-                <w:sz w:val="20"/>
-                <w:szCs w:val="20"/>
-              </w:rPr>
-              <w:t>Bronze / Silver / Gold / Platinum пакети за бизнеси</w:t>
+            <w:proofErr w:type="spellStart"/>
+            <w:r>
+              <w:rPr>
+                <w:sz w:val="20"/>
+                <w:szCs w:val="20"/>
+              </w:rPr>
+              <w:t>Bronze</w:t>
+            </w:r>
+            <w:proofErr w:type="spellEnd"/>
+            <w:r>
+              <w:rPr>
+                <w:sz w:val="20"/>
+                <w:szCs w:val="20"/>
+              </w:rPr>
+              <w:t xml:space="preserve"> / </w:t>
+            </w:r>
+            <w:proofErr w:type="spellStart"/>
+            <w:r>
+              <w:rPr>
+                <w:sz w:val="20"/>
+                <w:szCs w:val="20"/>
+              </w:rPr>
+              <w:t>Silver</w:t>
+            </w:r>
+            <w:proofErr w:type="spellEnd"/>
+            <w:r>
+              <w:rPr>
+                <w:sz w:val="20"/>
+                <w:szCs w:val="20"/>
+              </w:rPr>
+              <w:t xml:space="preserve"> / </w:t>
+            </w:r>
+            <w:proofErr w:type="spellStart"/>
+            <w:r>
+              <w:rPr>
+                <w:sz w:val="20"/>
+                <w:szCs w:val="20"/>
+              </w:rPr>
+              <w:t>Gold</w:t>
+            </w:r>
+            <w:proofErr w:type="spellEnd"/>
+            <w:r>
+              <w:rPr>
+                <w:sz w:val="20"/>
+                <w:szCs w:val="20"/>
+              </w:rPr>
+              <w:t xml:space="preserve"> / Platinum пакети за бизнеси</w:t>
             </w:r>
           </w:p>
         </w:tc>
@@ -5887,7 +6454,23 @@
                 <w:sz w:val="20"/>
                 <w:szCs w:val="20"/>
               </w:rPr>
-              <w:t>Брандиране на конкретни секции (напр. „Спорт by...“)</w:t>
+              <w:t xml:space="preserve">Брандиране на конкретни секции (напр. „Спорт </w:t>
+            </w:r>
+            <w:proofErr w:type="spellStart"/>
+            <w:r>
+              <w:rPr>
+                <w:sz w:val="20"/>
+                <w:szCs w:val="20"/>
+              </w:rPr>
+              <w:t>by</w:t>
+            </w:r>
+            <w:proofErr w:type="spellEnd"/>
+            <w:r>
+              <w:rPr>
+                <w:sz w:val="20"/>
+                <w:szCs w:val="20"/>
+              </w:rPr>
+              <w:t>...“)</w:t>
             </w:r>
           </w:p>
         </w:tc>
@@ -6040,11 +6623,13 @@
     <w:p>
       <w:pPr>
         <w:spacing w:after="120"/>
+        <w:ind w:left="708"/>
       </w:pPr>
     </w:p>
     <w:p>
       <w:pPr>
         <w:spacing w:before="300" w:after="150"/>
+        <w:ind w:left="708"/>
       </w:pPr>
       <w:r>
         <w:rPr>
@@ -6069,6 +6654,7 @@
     <w:p>
       <w:pPr>
         <w:spacing w:after="120" w:line="320" w:lineRule="auto"/>
+        <w:ind w:left="708"/>
       </w:pPr>
       <w:r>
         <w:t>Цените се преразглеждат ежемесечно. Предлагат се отстъпки за дългосрочни договори и стратегически партньори. Некомерческите организации и обществените институции получават преференциални условия.</w:t>
@@ -6080,7 +6666,7 @@
           <w:left w:val="single" w:sz="12" w:space="0" w:color="E87420"/>
         </w:pBdr>
         <w:spacing w:before="150" w:after="150"/>
-        <w:ind w:left="431" w:right="431"/>
+        <w:ind w:left="1139" w:right="431"/>
       </w:pPr>
       <w:r>
         <w:rPr>
@@ -6095,12 +6681,29 @@
           <w:i/>
           <w:iCs/>
         </w:rPr>
-        <w:t>Всички финансови операции се извършват чрез легални канали. zNews не приема приходи от доказано нелегални дейности.</w:t>
+        <w:t xml:space="preserve">Всички финансови операции се извършват чрез легални канали. </w:t>
+      </w:r>
+      <w:proofErr w:type="spellStart"/>
+      <w:r>
+        <w:rPr>
+          <w:i/>
+          <w:iCs/>
+        </w:rPr>
+        <w:t>zNews</w:t>
+      </w:r>
+      <w:proofErr w:type="spellEnd"/>
+      <w:r>
+        <w:rPr>
+          <w:i/>
+          <w:iCs/>
+        </w:rPr>
+        <w:t xml:space="preserve"> не приема приходи от доказано нелегални дейности.</w:t>
       </w:r>
     </w:p>
     <w:p>
       <w:pPr>
         <w:spacing w:after="120"/>
+        <w:ind w:left="708"/>
       </w:pPr>
     </w:p>
     <w:p>
@@ -6109,6 +6712,7 @@
           <w:bottom w:val="single" w:sz="6" w:space="0" w:color="CC0A1A"/>
         </w:pBdr>
         <w:spacing w:before="400" w:after="200"/>
+        <w:ind w:left="708"/>
       </w:pPr>
       <w:r>
         <w:rPr>
@@ -6133,6 +6737,7 @@
     <w:p>
       <w:pPr>
         <w:spacing w:before="300" w:after="150"/>
+        <w:ind w:left="708"/>
       </w:pPr>
       <w:r>
         <w:rPr>
@@ -6142,6 +6747,7 @@
           <w:sz w:val="26"/>
           <w:szCs w:val="26"/>
         </w:rPr>
+        <w:lastRenderedPageBreak/>
         <w:t xml:space="preserve">11.1 </w:t>
       </w:r>
       <w:r>
@@ -6157,6 +6763,7 @@
     <w:tbl>
       <w:tblPr>
         <w:tblW w:w="5000" w:type="pct"/>
+        <w:tblInd w:w="708" w:type="dxa"/>
         <w:tblBorders>
           <w:top w:val="single" w:sz="4" w:space="0" w:color="auto"/>
           <w:left w:val="single" w:sz="4" w:space="0" w:color="auto"/>
@@ -6449,16 +7056,19 @@
     <w:p>
       <w:pPr>
         <w:spacing w:after="120"/>
+        <w:ind w:left="708"/>
       </w:pPr>
     </w:p>
     <w:p>
       <w:pPr>
         <w:spacing w:after="120"/>
+        <w:ind w:left="708"/>
       </w:pPr>
     </w:p>
     <w:p>
       <w:pPr>
         <w:spacing w:before="300" w:after="150"/>
+        <w:ind w:left="708"/>
       </w:pPr>
       <w:r>
         <w:rPr>
@@ -6483,7 +7093,7 @@
     <w:p>
       <w:pPr>
         <w:spacing w:after="80" w:line="300" w:lineRule="auto"/>
-        <w:ind w:left="576"/>
+        <w:ind w:left="1284"/>
       </w:pPr>
       <w:r>
         <w:rPr>
@@ -6500,7 +7110,7 @@
     <w:p>
       <w:pPr>
         <w:spacing w:after="80" w:line="300" w:lineRule="auto"/>
-        <w:ind w:left="576"/>
+        <w:ind w:left="1284"/>
       </w:pPr>
       <w:r>
         <w:rPr>
@@ -6517,7 +7127,7 @@
     <w:p>
       <w:pPr>
         <w:spacing w:after="80" w:line="300" w:lineRule="auto"/>
-        <w:ind w:left="576"/>
+        <w:ind w:left="1284"/>
       </w:pPr>
       <w:r>
         <w:rPr>
@@ -6534,7 +7144,7 @@
     <w:p>
       <w:pPr>
         <w:spacing w:after="80" w:line="300" w:lineRule="auto"/>
-        <w:ind w:left="576"/>
+        <w:ind w:left="1284"/>
       </w:pPr>
       <w:r>
         <w:rPr>
@@ -6551,7 +7161,7 @@
     <w:p>
       <w:pPr>
         <w:spacing w:after="80" w:line="300" w:lineRule="auto"/>
-        <w:ind w:left="576"/>
+        <w:ind w:left="1284"/>
       </w:pPr>
       <w:r>
         <w:rPr>
@@ -6568,7 +7178,7 @@
     <w:p>
       <w:pPr>
         <w:spacing w:after="80" w:line="300" w:lineRule="auto"/>
-        <w:ind w:left="576"/>
+        <w:ind w:left="1284"/>
       </w:pPr>
       <w:r>
         <w:rPr>
@@ -6585,7 +7195,7 @@
     <w:p>
       <w:pPr>
         <w:spacing w:after="80" w:line="300" w:lineRule="auto"/>
-        <w:ind w:left="576"/>
+        <w:ind w:left="1284"/>
       </w:pPr>
       <w:r>
         <w:rPr>
@@ -6602,6 +7212,7 @@
     <w:p>
       <w:pPr>
         <w:spacing w:after="120"/>
+        <w:ind w:left="708"/>
       </w:pPr>
     </w:p>
     <w:p>
@@ -6610,6 +7221,7 @@
           <w:bottom w:val="single" w:sz="6" w:space="0" w:color="CC0A1A"/>
         </w:pBdr>
         <w:spacing w:before="400" w:after="200"/>
+        <w:ind w:left="708"/>
       </w:pPr>
       <w:r>
         <w:rPr>
@@ -6634,40 +7246,76 @@
     <w:p>
       <w:pPr>
         <w:spacing w:after="120" w:line="320" w:lineRule="auto"/>
-      </w:pPr>
-      <w:r>
-        <w:t>zNews е повече от новинарски сайт — това е обществена инфраструктура за Los Santos. Платформата комбинира професионална журналистика с практични обществени услуги: обяви за работа, съдебни хроники, събития и рекламна площ за градските бизнеси.</w:t>
+        <w:ind w:left="708"/>
+      </w:pPr>
+      <w:proofErr w:type="spellStart"/>
+      <w:r>
+        <w:t>zNews</w:t>
+      </w:r>
+      <w:proofErr w:type="spellEnd"/>
+      <w:r>
+        <w:t xml:space="preserve"> е повече от новинарски сайт — това е обществена инфраструктура за </w:t>
+      </w:r>
+      <w:proofErr w:type="spellStart"/>
+      <w:r>
+        <w:t>Los</w:t>
+      </w:r>
+      <w:proofErr w:type="spellEnd"/>
+      <w:r>
+        <w:t xml:space="preserve"> </w:t>
+      </w:r>
+      <w:proofErr w:type="spellStart"/>
+      <w:r>
+        <w:t>Santos</w:t>
+      </w:r>
+      <w:proofErr w:type="spellEnd"/>
+      <w:r>
+        <w:t>. Платформата комбинира професионална журналистика с практични обществени услуги: обяви за работа, съдебни хроники, събития и рекламна площ за градските бизнеси.</w:t>
       </w:r>
     </w:p>
     <w:p>
       <w:pPr>
         <w:spacing w:after="120" w:line="320" w:lineRule="auto"/>
-      </w:pPr>
-      <w:r>
-        <w:t>Моделът е устойчив, ако се спазват три основни принципа: редакционна независимост, прозрачност на финансирането и ангажираност с общността. С разнообразните си източници на приход (рекламни пакети, спонсорства, платени обяви) и ниските оперативни разходи, zNews е в позиция да бъде дългосрочен и влиятелен играч в медийната екосистема на града.</w:t>
+        <w:ind w:left="708"/>
+      </w:pPr>
+      <w:r>
+        <w:t xml:space="preserve">Моделът е устойчив, ако се спазват три основни принципа: редакционна независимост, прозрачност на финансирането и ангажираност с общността. С разнообразните си източници на приход (рекламни пакети, спонсорства, платени обяви) и ниските оперативни разходи, </w:t>
+      </w:r>
+      <w:proofErr w:type="spellStart"/>
+      <w:r>
+        <w:t>zNews</w:t>
+      </w:r>
+      <w:proofErr w:type="spellEnd"/>
+      <w:r>
+        <w:t xml:space="preserve"> е в позиция да бъде дългосрочен и влиятелен играч в медийната екосистема на града.</w:t>
       </w:r>
     </w:p>
     <w:p>
       <w:pPr>
         <w:spacing w:after="120" w:line="320" w:lineRule="auto"/>
-      </w:pPr>
-      <w:r>
+        <w:ind w:left="708"/>
+      </w:pPr>
+      <w:r>
+        <w:lastRenderedPageBreak/>
         <w:t>Този документ служи като основа за одобрение на бизнес концепцията и последващо развитие на платформата.</w:t>
       </w:r>
     </w:p>
     <w:p>
       <w:pPr>
         <w:spacing w:after="120"/>
+        <w:ind w:left="708"/>
       </w:pPr>
     </w:p>
     <w:p>
       <w:pPr>
         <w:spacing w:after="120"/>
+        <w:ind w:left="708"/>
       </w:pPr>
     </w:p>
     <w:p>
       <w:pPr>
         <w:spacing w:after="120"/>
+        <w:ind w:left="708"/>
       </w:pPr>
     </w:p>
     <w:p>
@@ -6676,11 +7324,13 @@
           <w:top w:val="single" w:sz="3" w:space="0" w:color="CC0A1A"/>
         </w:pBdr>
         <w:spacing w:before="400"/>
+        <w:ind w:left="708"/>
         <w:jc w:val="center"/>
         <w:rPr>
           <w:lang w:val="en-US"/>
         </w:rPr>
       </w:pPr>
+      <w:proofErr w:type="spellStart"/>
       <w:r>
         <w:rPr>
           <w:b/>
@@ -6700,6 +7350,7 @@
         </w:rPr>
         <w:t>NEWS</w:t>
       </w:r>
+      <w:proofErr w:type="spellEnd"/>
       <w:r>
         <w:rPr>
           <w:color w:val="D4CFC5"/>
@@ -6764,6 +7415,7 @@
     <w:pPr>
       <w:jc w:val="right"/>
     </w:pPr>
+    <w:proofErr w:type="spellStart"/>
     <w:r>
       <w:rPr>
         <w:i/>
@@ -6772,7 +7424,18 @@
         <w:sz w:val="16"/>
         <w:szCs w:val="16"/>
       </w:rPr>
-      <w:t>zNews  •  Бизнес план 2026</w:t>
+      <w:t>zNews</w:t>
+    </w:r>
+    <w:proofErr w:type="spellEnd"/>
+    <w:r>
+      <w:rPr>
+        <w:i/>
+        <w:iCs/>
+        <w:color w:val="D4CFC5"/>
+        <w:sz w:val="16"/>
+        <w:szCs w:val="16"/>
+      </w:rPr>
+      <w:t xml:space="preserve">  •  Бизнес план 2026</w:t>
     </w:r>
   </w:p>
 </w:hdr>

</xml_diff>